<commit_message>
Se tuvo la reunión del 11/09 y se avanzó con la definición del sistema en ASD, filtro de kalman y control.
</commit_message>
<xml_diff>
--- a/01_Documentos_Memoria/Versiones_consolidadas/Avance_1.docx
+++ b/01_Documentos_Memoria/Versiones_consolidadas/Avance_1.docx
@@ -492,9 +492,6 @@
         <w:t>Se autoriza la reproducción total o parcial, con fines académicos, por cualquier medio o procedimiento, incluyendo la cita bibliográfica del documento</w:t>
       </w:r>
       <w:r>
-        <w:rPr>
-          <w:lang w:val="en-GB"/>
-        </w:rPr>
         <w:br w:type="page"/>
       </w:r>
     </w:p>
@@ -508,7 +505,7 @@
           <w:kern w:val="2"/>
           <w:sz w:val="22"/>
           <w:szCs w:val="22"/>
-          <w:lang w:val="es-ES" w:eastAsia="en-US"/>
+          <w:lang w:eastAsia="en-US"/>
           <w14:ligatures w14:val="standardContextual"/>
         </w:rPr>
         <w:id w:val="-667707594"/>
@@ -520,8 +517,6 @@
       <w:sdtEndPr>
         <w:rPr>
           <w:rFonts w:eastAsiaTheme="minorEastAsia"/>
-          <w:noProof/>
-          <w:lang w:val="es-CL"/>
         </w:rPr>
       </w:sdtEndPr>
       <w:sdtContent>
@@ -541,7 +536,6 @@
               <w:color w:val="000000" w:themeColor="text1"/>
               <w:sz w:val="32"/>
               <w:szCs w:val="32"/>
-              <w:lang w:val="es-ES"/>
             </w:rPr>
             <w:t>Contenidos</w:t>
           </w:r>
@@ -579,13 +573,13 @@
             </w:rPr>
             <w:fldChar w:fldCharType="separate"/>
           </w:r>
-          <w:hyperlink w:anchor="_Toc239894265" w:history="1">
+          <w:hyperlink w:anchor="_Toc239978842" w:history="1">
             <w:r>
               <w:rPr>
                 <w:rStyle w:val="Hipervnculo"/>
                 <w:noProof/>
               </w:rPr>
-              <w:t>Lista de Figuras</w:t>
+              <w:t>Nomenclatura</w:t>
             </w:r>
             <w:r>
               <w:rPr>
@@ -606,7 +600,7 @@
                 <w:noProof/>
                 <w:webHidden/>
               </w:rPr>
-              <w:instrText xml:space="preserve"> PAGEREF _Toc239894265 \h </w:instrText>
+              <w:instrText xml:space="preserve"> PAGEREF _Toc239978842 \h </w:instrText>
             </w:r>
             <w:r>
               <w:rPr>
@@ -639,7 +633,7 @@
         </w:p>
         <w:p>
           <w:pPr>
-            <w:pStyle w:val="TDC1"/>
+            <w:pStyle w:val="TDC2"/>
             <w:tabs>
               <w:tab w:val="right" w:leader="dot" w:pos="8828"/>
             </w:tabs>
@@ -647,19 +641,19 @@
               <w:rFonts w:eastAsiaTheme="minorEastAsia"/>
               <w:b w:val="0"/>
               <w:bCs w:val="0"/>
-              <w:i w:val="0"/>
-              <w:iCs w:val="0"/>
               <w:noProof/>
+              <w:sz w:val="24"/>
+              <w:szCs w:val="24"/>
               <w:lang w:eastAsia="es-CL"/>
             </w:rPr>
           </w:pPr>
-          <w:hyperlink w:anchor="_Toc239894266" w:history="1">
+          <w:hyperlink w:anchor="_Toc239978843" w:history="1">
             <w:r>
               <w:rPr>
                 <w:rStyle w:val="Hipervnculo"/>
                 <w:noProof/>
               </w:rPr>
-              <w:t>Lista de Tablas</w:t>
+              <w:t>Símbolos griegos</w:t>
             </w:r>
             <w:r>
               <w:rPr>
@@ -680,7 +674,7 @@
                 <w:noProof/>
                 <w:webHidden/>
               </w:rPr>
-              <w:instrText xml:space="preserve"> PAGEREF _Toc239894266 \h </w:instrText>
+              <w:instrText xml:space="preserve"> PAGEREF _Toc239978843 \h </w:instrText>
             </w:r>
             <w:r>
               <w:rPr>
@@ -700,81 +694,7 @@
                 <w:noProof/>
                 <w:webHidden/>
               </w:rPr>
-              <w:t>2</w:t>
-            </w:r>
-            <w:r>
-              <w:rPr>
-                <w:noProof/>
-                <w:webHidden/>
-              </w:rPr>
-              <w:fldChar w:fldCharType="end"/>
-            </w:r>
-          </w:hyperlink>
-        </w:p>
-        <w:p>
-          <w:pPr>
-            <w:pStyle w:val="TDC1"/>
-            <w:tabs>
-              <w:tab w:val="right" w:leader="dot" w:pos="8828"/>
-            </w:tabs>
-            <w:rPr>
-              <w:rFonts w:eastAsiaTheme="minorEastAsia"/>
-              <w:b w:val="0"/>
-              <w:bCs w:val="0"/>
-              <w:i w:val="0"/>
-              <w:iCs w:val="0"/>
-              <w:noProof/>
-              <w:lang w:eastAsia="es-CL"/>
-            </w:rPr>
-          </w:pPr>
-          <w:hyperlink w:anchor="_Toc239894267" w:history="1">
-            <w:r>
-              <w:rPr>
-                <w:rStyle w:val="Hipervnculo"/>
-                <w:noProof/>
-              </w:rPr>
-              <w:t>Nomenclatura</w:t>
-            </w:r>
-            <w:r>
-              <w:rPr>
-                <w:noProof/>
-                <w:webHidden/>
-              </w:rPr>
-              <w:tab/>
-            </w:r>
-            <w:r>
-              <w:rPr>
-                <w:noProof/>
-                <w:webHidden/>
-              </w:rPr>
-              <w:fldChar w:fldCharType="begin"/>
-            </w:r>
-            <w:r>
-              <w:rPr>
-                <w:noProof/>
-                <w:webHidden/>
-              </w:rPr>
-              <w:instrText xml:space="preserve"> PAGEREF _Toc239894267 \h </w:instrText>
-            </w:r>
-            <w:r>
-              <w:rPr>
-                <w:noProof/>
-                <w:webHidden/>
-              </w:rPr>
-            </w:r>
-            <w:r>
-              <w:rPr>
-                <w:noProof/>
-                <w:webHidden/>
-              </w:rPr>
-              <w:fldChar w:fldCharType="separate"/>
-            </w:r>
-            <w:r>
-              <w:rPr>
-                <w:noProof/>
-                <w:webHidden/>
-              </w:rPr>
-              <w:t>3</w:t>
+              <w:t>1</w:t>
             </w:r>
             <w:r>
               <w:rPr>
@@ -802,7 +722,7 @@
               <w:lang w:eastAsia="es-CL"/>
             </w:rPr>
           </w:pPr>
-          <w:hyperlink w:anchor="_Toc239894268" w:history="1">
+          <w:hyperlink w:anchor="_Toc239978844" w:history="1">
             <w:r>
               <w:rPr>
                 <w:rStyle w:val="Hipervnculo"/>
@@ -848,7 +768,7 @@
                 <w:noProof/>
                 <w:webHidden/>
               </w:rPr>
-              <w:instrText xml:space="preserve"> PAGEREF _Toc239894268 \h </w:instrText>
+              <w:instrText xml:space="preserve"> PAGEREF _Toc239978844 \h </w:instrText>
             </w:r>
             <w:r>
               <w:rPr>
@@ -868,7 +788,7 @@
                 <w:noProof/>
                 <w:webHidden/>
               </w:rPr>
-              <w:t>4</w:t>
+              <w:t>2</w:t>
             </w:r>
             <w:r>
               <w:rPr>
@@ -896,7 +816,7 @@
               <w:lang w:eastAsia="es-CL"/>
             </w:rPr>
           </w:pPr>
-          <w:hyperlink w:anchor="_Toc239894269" w:history="1">
+          <w:hyperlink w:anchor="_Toc239978845" w:history="1">
             <w:r>
               <w:rPr>
                 <w:rStyle w:val="Hipervnculo"/>
@@ -921,7 +841,7 @@
                 <w:rStyle w:val="Hipervnculo"/>
                 <w:noProof/>
               </w:rPr>
-              <w:t>Contexto</w:t>
+              <w:t>Contexto y planteamiento del problema</w:t>
             </w:r>
             <w:r>
               <w:rPr>
@@ -942,7 +862,7 @@
                 <w:noProof/>
                 <w:webHidden/>
               </w:rPr>
-              <w:instrText xml:space="preserve"> PAGEREF _Toc239894269 \h </w:instrText>
+              <w:instrText xml:space="preserve"> PAGEREF _Toc239978845 \h </w:instrText>
             </w:r>
             <w:r>
               <w:rPr>
@@ -962,7 +882,7 @@
                 <w:noProof/>
                 <w:webHidden/>
               </w:rPr>
-              <w:t>4</w:t>
+              <w:t>2</w:t>
             </w:r>
             <w:r>
               <w:rPr>
@@ -990,7 +910,7 @@
               <w:lang w:eastAsia="es-CL"/>
             </w:rPr>
           </w:pPr>
-          <w:hyperlink w:anchor="_Toc239894270" w:history="1">
+          <w:hyperlink w:anchor="_Toc239978846" w:history="1">
             <w:r>
               <w:rPr>
                 <w:rStyle w:val="Hipervnculo"/>
@@ -1036,7 +956,7 @@
                 <w:noProof/>
                 <w:webHidden/>
               </w:rPr>
-              <w:instrText xml:space="preserve"> PAGEREF _Toc239894270 \h </w:instrText>
+              <w:instrText xml:space="preserve"> PAGEREF _Toc239978846 \h </w:instrText>
             </w:r>
             <w:r>
               <w:rPr>
@@ -1056,7 +976,7 @@
                 <w:noProof/>
                 <w:webHidden/>
               </w:rPr>
-              <w:t>8</w:t>
+              <w:t>5</w:t>
             </w:r>
             <w:r>
               <w:rPr>
@@ -1084,7 +1004,7 @@
               <w:lang w:eastAsia="es-CL"/>
             </w:rPr>
           </w:pPr>
-          <w:hyperlink w:anchor="_Toc239894271" w:history="1">
+          <w:hyperlink w:anchor="_Toc239978847" w:history="1">
             <w:r>
               <w:rPr>
                 <w:rStyle w:val="Hipervnculo"/>
@@ -1130,7 +1050,7 @@
                 <w:noProof/>
                 <w:webHidden/>
               </w:rPr>
-              <w:instrText xml:space="preserve"> PAGEREF _Toc239894271 \h </w:instrText>
+              <w:instrText xml:space="preserve"> PAGEREF _Toc239978847 \h </w:instrText>
             </w:r>
             <w:r>
               <w:rPr>
@@ -1150,7 +1070,7 @@
                 <w:noProof/>
                 <w:webHidden/>
               </w:rPr>
-              <w:t>8</w:t>
+              <w:t>5</w:t>
             </w:r>
             <w:r>
               <w:rPr>
@@ -1176,7 +1096,7 @@
               <w:lang w:eastAsia="es-CL"/>
             </w:rPr>
           </w:pPr>
-          <w:hyperlink w:anchor="_Toc239894272" w:history="1">
+          <w:hyperlink w:anchor="_Toc239978848" w:history="1">
             <w:r>
               <w:rPr>
                 <w:rStyle w:val="Hipervnculo"/>
@@ -1220,7 +1140,7 @@
                 <w:noProof/>
                 <w:webHidden/>
               </w:rPr>
-              <w:instrText xml:space="preserve"> PAGEREF _Toc239894272 \h </w:instrText>
+              <w:instrText xml:space="preserve"> PAGEREF _Toc239978848 \h </w:instrText>
             </w:r>
             <w:r>
               <w:rPr>
@@ -1240,101 +1160,7 @@
                 <w:noProof/>
                 <w:webHidden/>
               </w:rPr>
-              <w:t>9</w:t>
-            </w:r>
-            <w:r>
-              <w:rPr>
-                <w:noProof/>
-                <w:webHidden/>
-              </w:rPr>
-              <w:fldChar w:fldCharType="end"/>
-            </w:r>
-          </w:hyperlink>
-        </w:p>
-        <w:p>
-          <w:pPr>
-            <w:pStyle w:val="TDC2"/>
-            <w:tabs>
-              <w:tab w:val="left" w:pos="880"/>
-              <w:tab w:val="right" w:leader="dot" w:pos="8828"/>
-            </w:tabs>
-            <w:rPr>
-              <w:rFonts w:eastAsiaTheme="minorEastAsia"/>
-              <w:b w:val="0"/>
-              <w:bCs w:val="0"/>
-              <w:noProof/>
-              <w:sz w:val="24"/>
-              <w:szCs w:val="24"/>
-              <w:lang w:eastAsia="es-CL"/>
-            </w:rPr>
-          </w:pPr>
-          <w:hyperlink w:anchor="_Toc239894273" w:history="1">
-            <w:r>
-              <w:rPr>
-                <w:rStyle w:val="Hipervnculo"/>
-                <w:noProof/>
-              </w:rPr>
-              <w:t>1.4</w:t>
-            </w:r>
-            <w:r>
-              <w:rPr>
-                <w:rFonts w:eastAsiaTheme="minorEastAsia"/>
-                <w:b w:val="0"/>
-                <w:bCs w:val="0"/>
-                <w:noProof/>
-                <w:sz w:val="24"/>
-                <w:szCs w:val="24"/>
-                <w:lang w:eastAsia="es-CL"/>
-              </w:rPr>
-              <w:tab/>
-            </w:r>
-            <w:r>
-              <w:rPr>
-                <w:rStyle w:val="Hipervnculo"/>
-                <w:noProof/>
-              </w:rPr>
-              <w:t>Descripción del trabajo</w:t>
-            </w:r>
-            <w:r>
-              <w:rPr>
-                <w:noProof/>
-                <w:webHidden/>
-              </w:rPr>
-              <w:tab/>
-            </w:r>
-            <w:r>
-              <w:rPr>
-                <w:noProof/>
-                <w:webHidden/>
-              </w:rPr>
-              <w:fldChar w:fldCharType="begin"/>
-            </w:r>
-            <w:r>
-              <w:rPr>
-                <w:noProof/>
-                <w:webHidden/>
-              </w:rPr>
-              <w:instrText xml:space="preserve"> PAGEREF _Toc239894273 \h </w:instrText>
-            </w:r>
-            <w:r>
-              <w:rPr>
-                <w:noProof/>
-                <w:webHidden/>
-              </w:rPr>
-            </w:r>
-            <w:r>
-              <w:rPr>
-                <w:noProof/>
-                <w:webHidden/>
-              </w:rPr>
-              <w:fldChar w:fldCharType="separate"/>
-            </w:r>
-            <w:r>
-              <w:rPr>
-                <w:noProof/>
-                <w:webHidden/>
-              </w:rPr>
-              <w:t>9</w:t>
+              <w:t>5</w:t>
             </w:r>
             <w:r>
               <w:rPr>
@@ -1362,7 +1188,7 @@
               <w:lang w:eastAsia="es-CL"/>
             </w:rPr>
           </w:pPr>
-          <w:hyperlink w:anchor="_Toc239894274" w:history="1">
+          <w:hyperlink w:anchor="_Toc239978849" w:history="1">
             <w:r>
               <w:rPr>
                 <w:rStyle w:val="Hipervnculo"/>
@@ -1408,7 +1234,7 @@
                 <w:noProof/>
                 <w:webHidden/>
               </w:rPr>
-              <w:instrText xml:space="preserve"> PAGEREF _Toc239894274 \h </w:instrText>
+              <w:instrText xml:space="preserve"> PAGEREF _Toc239978849 \h </w:instrText>
             </w:r>
             <w:r>
               <w:rPr>
@@ -1428,7 +1254,7 @@
                 <w:noProof/>
                 <w:webHidden/>
               </w:rPr>
-              <w:t>9</w:t>
+              <w:t>5</w:t>
             </w:r>
             <w:r>
               <w:rPr>
@@ -1455,12 +1281,11 @@
               <w:lang w:eastAsia="es-CL"/>
             </w:rPr>
           </w:pPr>
-          <w:hyperlink w:anchor="_Toc239894275" w:history="1">
+          <w:hyperlink w:anchor="_Toc239978850" w:history="1">
             <w:r>
               <w:rPr>
                 <w:rStyle w:val="Hipervnculo"/>
                 <w:noProof/>
-                <w:lang w:val="en-US"/>
               </w:rPr>
               <w:t>Referencias</w:t>
             </w:r>
@@ -1483,7 +1308,7 @@
                 <w:noProof/>
                 <w:webHidden/>
               </w:rPr>
-              <w:instrText xml:space="preserve"> PAGEREF _Toc239894275 \h </w:instrText>
+              <w:instrText xml:space="preserve"> PAGEREF _Toc239978850 \h </w:instrText>
             </w:r>
             <w:r>
               <w:rPr>
@@ -1503,7 +1328,7 @@
                 <w:noProof/>
                 <w:webHidden/>
               </w:rPr>
-              <w:t>11</w:t>
+              <w:t>7</w:t>
             </w:r>
             <w:r>
               <w:rPr>
@@ -1519,7 +1344,6 @@
             <w:rPr>
               <w:b/>
               <w:bCs/>
-              <w:noProof/>
             </w:rPr>
             <w:fldChar w:fldCharType="end"/>
           </w:r>
@@ -1579,14 +1403,168 @@
           <w:ilvl w:val="0"/>
           <w:numId w:val="0"/>
         </w:numPr>
-      </w:pPr>
-      <w:bookmarkStart w:id="0" w:name="_Toc239894265"/>
+        <w:ind w:left="432" w:hanging="432"/>
+      </w:pPr>
+      <w:bookmarkStart w:id="0" w:name="_Toc239978842"/>
       <w:r>
         <w:lastRenderedPageBreak/>
-        <w:t>Lista de Figuras</w:t>
+        <w:t>Nomenclatura</w:t>
       </w:r>
       <w:bookmarkEnd w:id="0"/>
     </w:p>
+    <w:p>
+      <w:r>
+        <w:t xml:space="preserve">CFD: Computational Fluid Dynamics </w:t>
+      </w:r>
+    </w:p>
+    <w:p>
+      <w:r>
+        <w:t>COTS: Commercial Off-The-Shelf</w:t>
+      </w:r>
+    </w:p>
+    <w:p>
+      <w:r>
+        <w:t>Datcom: Data Compendium</w:t>
+      </w:r>
+    </w:p>
+    <w:p>
+      <w:r>
+        <w:t xml:space="preserve">LOC: Loss of Control </w:t>
+      </w:r>
+    </w:p>
+    <w:p>
+      <w:r>
+        <w:t xml:space="preserve">NACA: National Advisory Committee for Aeronautics </w:t>
+      </w:r>
+    </w:p>
+    <w:p>
+      <w:r>
+        <w:t xml:space="preserve">RMS: Root Mean Square </w:t>
+      </w:r>
+    </w:p>
+    <w:p>
+      <w:r>
+        <w:t>SIPRI: Stockholm International Peace Research Institute</w:t>
+      </w:r>
+    </w:p>
+    <w:p>
+      <w:r>
+        <w:t xml:space="preserve">UAV: Unmanned Aerial Vehicle </w:t>
+      </w:r>
+    </w:p>
+    <w:p>
+      <w:r>
+        <w:t xml:space="preserve">USD: United States Dollar </w:t>
+      </w:r>
+    </w:p>
+    <w:p/>
+    <w:p>
+      <w:pPr>
+        <w:pStyle w:val="Ttulo2"/>
+        <w:numPr>
+          <w:ilvl w:val="0"/>
+          <w:numId w:val="0"/>
+        </w:numPr>
+        <w:ind w:left="576" w:hanging="576"/>
+      </w:pPr>
+      <w:bookmarkStart w:id="1" w:name="_Toc239978843"/>
+      <w:r>
+        <w:t>Símbolos griegos</w:t>
+      </w:r>
+      <w:bookmarkEnd w:id="1"/>
+    </w:p>
+    <w:p>
+      <m:oMath>
+        <m:r>
+          <w:rPr>
+            <w:rFonts w:ascii="Cambria Math" w:hAnsi="Cambria Math"/>
+          </w:rPr>
+          <m:t>α</m:t>
+        </m:r>
+      </m:oMath>
+      <w:r>
+        <w:rPr>
+          <w:rFonts w:eastAsiaTheme="minorEastAsia"/>
+        </w:rPr>
+        <w:t xml:space="preserve"> </w:t>
+      </w:r>
+      <w:r>
+        <w:rPr>
+          <w:b/>
+          <w:bCs/>
+        </w:rPr>
+        <w:t>:</w:t>
+      </w:r>
+      <w:r>
+        <w:t xml:space="preserve"> Ángulo de ataque</w:t>
+      </w:r>
+    </w:p>
+    <w:p>
+      <m:oMath>
+        <m:sSub>
+          <m:sSubPr>
+            <m:ctrlPr>
+              <w:rPr>
+                <w:rFonts w:ascii="Cambria Math" w:hAnsi="Cambria Math"/>
+              </w:rPr>
+            </m:ctrlPr>
+          </m:sSubPr>
+          <m:e>
+            <m:r>
+              <w:rPr>
+                <w:rFonts w:ascii="Cambria Math" w:hAnsi="Cambria Math"/>
+              </w:rPr>
+              <m:t>C</m:t>
+            </m:r>
+          </m:e>
+          <m:sub>
+            <m:r>
+              <w:rPr>
+                <w:rFonts w:ascii="Cambria Math" w:hAnsi="Cambria Math"/>
+              </w:rPr>
+              <m:t>h</m:t>
+            </m:r>
+          </m:sub>
+        </m:sSub>
+      </m:oMath>
+      <w:r>
+        <w:rPr>
+          <w:b/>
+          <w:bCs/>
+        </w:rPr>
+        <w:t>:</w:t>
+      </w:r>
+      <w:r>
+        <w:t xml:space="preserve"> Coeficiente de momento de bisagra</w:t>
+      </w:r>
+    </w:p>
+    <w:p>
+      <m:oMath>
+        <m:r>
+          <w:rPr>
+            <w:rFonts w:ascii="Cambria Math" w:hAnsi="Cambria Math"/>
+          </w:rPr>
+          <m:t>δ</m:t>
+        </m:r>
+      </m:oMath>
+      <w:r>
+        <w:rPr>
+          <w:rFonts w:eastAsiaTheme="minorEastAsia"/>
+        </w:rPr>
+        <w:t xml:space="preserve"> </w:t>
+      </w:r>
+      <w:r>
+        <w:rPr>
+          <w:b/>
+          <w:bCs/>
+        </w:rPr>
+        <w:t>:</w:t>
+      </w:r>
+      <w:r>
+        <w:t xml:space="preserve"> Ángulo de deflexión de la superficie de control.</w:t>
+      </w:r>
+    </w:p>
+    <w:p/>
     <w:p>
       <w:pPr>
         <w:spacing w:after="160" w:line="259" w:lineRule="auto"/>
@@ -1611,1124 +1589,760 @@
     <w:p>
       <w:pPr>
         <w:pStyle w:val="Ttulo1"/>
-        <w:numPr>
-          <w:ilvl w:val="0"/>
-          <w:numId w:val="0"/>
-        </w:numPr>
-        <w:ind w:left="432" w:hanging="432"/>
-      </w:pPr>
-      <w:bookmarkStart w:id="1" w:name="_Toc239894266"/>
+      </w:pPr>
+      <w:bookmarkStart w:id="2" w:name="_Toc239978844"/>
       <w:r>
         <w:lastRenderedPageBreak/>
-        <w:t>Lista de Tablas</w:t>
-      </w:r>
-      <w:bookmarkEnd w:id="1"/>
+        <w:t>Introducción</w:t>
+      </w:r>
+      <w:bookmarkEnd w:id="2"/>
+    </w:p>
+    <w:p>
+      <w:pPr>
+        <w:pStyle w:val="Ttulo2"/>
+      </w:pPr>
+      <w:bookmarkStart w:id="3" w:name="_Toc239978845"/>
+      <w:r>
+        <w:t>Contexto</w:t>
+      </w:r>
+      <w:r>
+        <w:t xml:space="preserve"> y planteamiento del problema</w:t>
+      </w:r>
+      <w:bookmarkEnd w:id="3"/>
+    </w:p>
+    <w:p>
+      <w:r>
+        <w:t>El diseño de vehículos aeroespaciales con superficies de control (misiles, UAV y otros sistemas con aletas, elevadores o alerones) depende de forma crítica de una etapa que rara vez recibe la misma atención que la aerodinámica o la estructura: la validación física del actuador que finalmente moverá dichas superficies bajo las cargas reales de operación. Durante décadas, esa validación se apoyó casi exclusivamente en el ensayo en túnel de viento y en el vuelo instrumentado, ambos de alto costo y baja flexibilidad. La irrupción de la simulación computacional como herramienta madura de predicción de cargas (capaz hoy de sustituir buena parte, aunque no la totalidad, de esas campañas físicas) abre una posibilidad concreta: generar cargas aerodinámicas confiables por simulación y usarlas para caracterizar y poner a prueba actuadores antes de integrarlos en un vehículo completo. Sin embargo, entre la tabla de cargas que entrega una simulación computacional y el actuador físico que debe reproducir esas condiciones existe una brecha metodológica poco resuelta, particularmente para organizaciones</w:t>
+      </w:r>
+      <w:r>
+        <w:t xml:space="preserve"> </w:t>
+      </w:r>
+      <w:r>
+        <w:t xml:space="preserve">que no cuentan con acceso rutinario a un túnel de viento </w:t>
+      </w:r>
+      <w:r>
+        <w:t>adecuado. En esta sección se</w:t>
+      </w:r>
+      <w:r>
+        <w:t xml:space="preserve"> desarrolla por qué esa brecha es relevante de cerrar y qué evidencia cuantitativa la respalda.</w:t>
+      </w:r>
+    </w:p>
+    <w:p>
+      <w:r>
+        <w:t xml:space="preserve">La sofisticación de las superficies de control ha crecido en paralelo a la industria que las utiliza. </w:t>
+      </w:r>
+      <w:bookmarkStart w:id="4" w:name="ZOTERO_BREF_j71xDLKcmJ6Z"/>
+      <w:r>
+        <w:rPr>
+          <w:rFonts w:cs="Arial"/>
+        </w:rPr>
+        <w:t>[1]</w:t>
+      </w:r>
+      <w:bookmarkEnd w:id="4"/>
+      <w:r>
+        <w:t xml:space="preserve"> </w:t>
+      </w:r>
+      <w:r>
+        <w:t>D</w:t>
+      </w:r>
+      <w:r>
+        <w:t>ocumenta cómo la predicción del momento de bisagra (la carga que un actuador debe vencer) ha evolucionado desde relaciones semi-empíricas (Datcom) hacia CFD viscoso de alta fidelidad, mientras que</w:t>
+      </w:r>
+      <w:r>
+        <w:t xml:space="preserve"> </w:t>
+      </w:r>
+      <w:bookmarkStart w:id="5" w:name="ZOTERO_BREF_J8t4ZwDeosRD"/>
+      <w:r>
+        <w:rPr>
+          <w:rFonts w:cs="Arial"/>
+        </w:rPr>
+        <w:t>[2]</w:t>
+      </w:r>
+      <w:bookmarkEnd w:id="5"/>
+      <w:r>
+        <w:t xml:space="preserve"> y</w:t>
+      </w:r>
+      <w:r>
+        <w:t xml:space="preserve"> </w:t>
+      </w:r>
+      <w:bookmarkStart w:id="6" w:name="ZOTERO_BREF_QC5oULHURREB"/>
+      <w:r>
+        <w:rPr>
+          <w:rFonts w:cs="Arial"/>
+        </w:rPr>
+        <w:t>[3]</w:t>
+      </w:r>
+      <w:bookmarkEnd w:id="6"/>
+      <w:r>
+        <w:t xml:space="preserve"> muestran que ya es posible generar bases de datos aerodinámicas multidimensionales a partir de un número acotado de simulaciones, con errores de interpolación reportados por debajo del 1 % en modelos de orden reducido para misiles subsónicos. El eslabón que sigue sin estandarizarse es precisamente el que traduce esa tabla de cargas en un ensayo físico sobre el actuador candidato: </w:t>
+      </w:r>
+      <w:bookmarkStart w:id="7" w:name="ZOTERO_BREF_ijX0cLB6825I"/>
+      <w:r>
+        <w:rPr>
+          <w:rFonts w:cs="Arial"/>
+        </w:rPr>
+        <w:t>[4]</w:t>
+      </w:r>
+      <w:bookmarkEnd w:id="7"/>
+      <w:r>
+        <w:rPr>
+          <w:rFonts w:cs="Arial"/>
+        </w:rPr>
+        <w:t xml:space="preserve"> </w:t>
+      </w:r>
+      <w:r>
+        <w:t>son el antecedente más cercano, un banco tipo dinamómetro que aplica torque de carga sobre el eje de bisagra de un servoactuador de UAV. Pero permanece como un caso aislado, no como una metodología replicada ampliamente.</w:t>
+      </w:r>
+      <w:r>
+        <w:t xml:space="preserve"> </w:t>
+      </w:r>
+      <w:r>
+        <w:t xml:space="preserve">La urgencia tecnológica de resolver esta brecha se aprecia también en las cifras de seguridad de vuelo. Según </w:t>
+      </w:r>
+      <w:bookmarkStart w:id="8" w:name="ZOTERO_BREF_2k1ZKBE6D55m"/>
+      <w:r>
+        <w:rPr>
+          <w:rFonts w:cs="Arial"/>
+        </w:rPr>
+        <w:t>[5]</w:t>
+      </w:r>
+      <w:bookmarkEnd w:id="8"/>
+      <w:r>
+        <w:t xml:space="preserve"> la pérdida de control en vuelo (Loss of Control, LOC) fue la causa individual con más víctimas fatales en la aviación comercial entre 2008 y 2017, con 14 accidentes y 1.129 fallecidos. Las fallas de actuadores y de superficies de control figuran de forma explícita entre los modos de falla que derivan en pérdida de control, tanto en aviación tripulada como en UAV</w:t>
+      </w:r>
+      <w:r>
+        <w:t xml:space="preserve"> </w:t>
+      </w:r>
+      <w:bookmarkStart w:id="9" w:name="ZOTERO_BREF_xEmrBpvpW2UM"/>
+      <w:r>
+        <w:rPr>
+          <w:rFonts w:cs="Arial"/>
+        </w:rPr>
+        <w:t>[6]</w:t>
+      </w:r>
+      <w:bookmarkEnd w:id="9"/>
+      <w:r>
+        <w:t>.</w:t>
+      </w:r>
+    </w:p>
+    <w:p>
+      <w:r>
+        <w:t xml:space="preserve">La magnitud económica del sector que consume esta tecnología es sustancial y sigue creciendo tanto en su vertiente militar como en su vertiente civil. Por el lado militar, el mercado global de municiones guiadas de precisión, la aplicación típica de superficies de control </w:t>
+      </w:r>
+      <w:r>
+        <w:t>actuadas</w:t>
+      </w:r>
+      <w:r>
+        <w:t xml:space="preserve"> se valoró en aproximadamente USD 36.500 millones en 2024, con proyecciones de crecimiento a una tasa anual compuesta cercana al 5 % hasta superar los USD 59.000 millones hacia 2034</w:t>
+      </w:r>
+      <w:r>
+        <w:t xml:space="preserve"> </w:t>
+      </w:r>
+      <w:bookmarkStart w:id="10" w:name="ZOTERO_BREF_7wDCmXQ32UHB"/>
+      <w:r>
+        <w:rPr>
+          <w:rFonts w:cs="Arial"/>
+        </w:rPr>
+        <w:t>[7]</w:t>
+      </w:r>
+      <w:bookmarkEnd w:id="10"/>
+      <w:r>
+        <w:t xml:space="preserve">. Por el lado civil y comercial, el mercado de drones para agricultura de precisión, inspección de infraestructura, logística y monitoreo ambiental se valoró entre USD 12.500 y 15.000 millones en 2025-2026, con una tasa de crecimiento anual proyectada de hasta 18,6 %, sustancialmente más rápida que el crecimiento del </w:t>
+      </w:r>
+      <w:r>
+        <w:lastRenderedPageBreak/>
+        <w:t>segmento militar, y se espera que alcance entre USD 69.000 y 96.000 millones hacia comienzos de la próxima década</w:t>
+      </w:r>
+      <w:r>
+        <w:t xml:space="preserve"> </w:t>
+      </w:r>
+      <w:bookmarkStart w:id="11" w:name="ZOTERO_BREF_PzuYSVYkpOjO"/>
+      <w:r>
+        <w:rPr>
+          <w:rFonts w:cs="Arial"/>
+        </w:rPr>
+        <w:t>[8]</w:t>
+      </w:r>
+      <w:bookmarkEnd w:id="11"/>
+      <w:r>
+        <w:t>. El mercado agregado de UAV (que combina ambos usos) confirma esta tendencia: se sitúa entre USD 26.000 y 40.000 millones en 2025, y el propio segmento comercial es señalado por</w:t>
+      </w:r>
+      <w:r>
+        <w:t xml:space="preserve"> </w:t>
+      </w:r>
+      <w:bookmarkStart w:id="12" w:name="ZOTERO_BREF_502sMrmdBj9v"/>
+      <w:r>
+        <w:rPr>
+          <w:rFonts w:cs="Arial"/>
+        </w:rPr>
+        <w:t>[9]</w:t>
+      </w:r>
+      <w:bookmarkEnd w:id="12"/>
+      <w:r>
+        <w:t xml:space="preserve"> como el de mayor tasa de crecimiento dentro de esa cifra total (25,4 % proyectado a 2030 por sobre el segmento de defensa). En ambos casos (el civil y militar) el actuador de la superficie de control es un componente </w:t>
+      </w:r>
+      <w:r>
+        <w:t>común</w:t>
+      </w:r>
+      <w:r>
+        <w:t>, por lo que el problema de caracterizarlo bajo carga representativa no es exclusivo de una sola industria, sino transversal a ambas.</w:t>
+      </w:r>
+      <w:r>
+        <w:t xml:space="preserve"> </w:t>
+      </w:r>
+      <w:r>
+        <w:t>Esa escala económica, civil y militar por igual, convive con un costo de validación experimental que sigue siendo alto para cualquiera de las dos aplicaciones. El ensayo en túnel de viento tiene un costo típico de entre USD 200 y 1.000 por hora para instalaciones convencionales, y puede superar los USD 20.000 por hora en túneles de gran escala, sin contar el costo de fabricación de un modelo físico instrumentado, que puede alcanzar el millón de dólares</w:t>
+      </w:r>
+      <w:r>
+        <w:t xml:space="preserve"> </w:t>
+      </w:r>
+      <w:bookmarkStart w:id="13" w:name="ZOTERO_BREF_j4gwILHuPfne"/>
+      <w:r>
+        <w:rPr>
+          <w:rFonts w:cs="Arial"/>
+        </w:rPr>
+        <w:t>[10]</w:t>
+      </w:r>
+      <w:bookmarkEnd w:id="13"/>
+      <w:r>
+        <w:t xml:space="preserve">. Este costo golpea de forma proporcionalmente mayor a los desarrolladores de UAV comerciales y a los equipos de investigación </w:t>
+      </w:r>
+      <w:r>
+        <w:t>aplicada, que</w:t>
+      </w:r>
+      <w:r>
+        <w:t xml:space="preserve"> operan con presupuestos muy inferiores a los de un programa de defensa. La incorporación temprana de simulación computacional ya ha demostrado, en la práctica industrial civil y militar, una reducción de hasta un 60 % en costos y de hasta un 80 % en tiempo de desarrollo en casos documentados, y Boeing redujo el número de ensayos en túnel de viento necesarios para el diseño de alas de aeronaves comerciales de 77 en la década de 1970 a solo 10 hacia fines de los años noventa (una reducción del 87 %) gracias a la adopción progresiva de CFD</w:t>
+      </w:r>
+      <w:r>
+        <w:t xml:space="preserve"> </w:t>
+      </w:r>
+      <w:bookmarkStart w:id="14" w:name="ZOTERO_BREF_qczaH9J2IZhE"/>
+      <w:r>
+        <w:rPr>
+          <w:rFonts w:cs="Arial"/>
+        </w:rPr>
+        <w:t>[11]</w:t>
+      </w:r>
+      <w:bookmarkEnd w:id="14"/>
+      <w:r>
+        <w:t>.</w:t>
+      </w:r>
+      <w:r>
+        <w:t xml:space="preserve"> </w:t>
+      </w:r>
+      <w:r>
+        <w:t xml:space="preserve">Este problema tiene además una dimensión económica local concreta que combina ambas vertientes. Según el informe SIPRI 2025, Chile es el cuarto país de mayor gasto en defensa de América Latina, con USD 5.105 millones en 2024, y la Fuerza Aérea de Chile proyecta la incorporación de una flota de entre 12 y 36 vehículos aéreos no tripulados de combate hacia el período 2025-2026 </w:t>
+      </w:r>
+      <w:bookmarkStart w:id="15" w:name="ZOTERO_BREF_OMrL5Yu3fLL6"/>
+      <w:r>
+        <w:rPr>
+          <w:rFonts w:cs="Arial"/>
+        </w:rPr>
+        <w:t>[12]</w:t>
+      </w:r>
+      <w:bookmarkEnd w:id="15"/>
+      <w:r>
+        <w:t>. En paralelo, el país es también un mercado creciente de UAV civiles para minería, agricultura y monitoreo geográfico, sectores relevantes para la economía nacional no ligada a defensa. En ese contexto, contar con capacidades nacionales de validación experimental de bajo costo para actuadores de superficies de control, aplicables indistintamente a un proyecto de UAV civil de laboratorio o a uno de interés para las Fuerzas Armadas en vez de depender exclusivamente de ensayos contratados en el extranjero, tiene un valor económico directo tanto para instituciones de investigación y formación como para el desarrollo de una industria de drones civiles emergente en el país.</w:t>
+      </w:r>
+    </w:p>
+    <w:p>
+      <w:r>
+        <w:t xml:space="preserve">La huella ambiental de la validación experimental física es habitualmente subestimada. Un túnel de viento de gran escala </w:t>
+      </w:r>
+      <w:r>
+        <w:t>(</w:t>
+      </w:r>
+      <w:r>
+        <w:t>como el usado históricamente para el desarrollo del Boeing 747</w:t>
+      </w:r>
+      <w:r>
+        <w:t>)</w:t>
+      </w:r>
+      <w:r>
+        <w:t xml:space="preserve"> requirió del orden de 10.000 horas de operación con ventiladores de hasta 7 MW de potencia. Lo que implica un consumo energético del orden de 10⁸ kWh solo para esa campaña de ensayos</w:t>
+      </w:r>
+      <w:r>
+        <w:t xml:space="preserve"> </w:t>
+      </w:r>
+      <w:bookmarkStart w:id="16" w:name="ZOTERO_BREF_BvgxpLwLSaa7"/>
+      <w:r>
+        <w:rPr>
+          <w:rFonts w:cs="Arial"/>
+        </w:rPr>
+        <w:t>[11]</w:t>
+      </w:r>
+      <w:bookmarkEnd w:id="16"/>
+      <w:r>
+        <w:t>. La sustitución progresiva de una parte de esas horas de túnel por simulación computacional (el 87 % ya mencionad</w:t>
+      </w:r>
+      <w:r>
+        <w:t>o</w:t>
+      </w:r>
+      <w:r>
+        <w:t xml:space="preserve"> en el caso de Boeing) reduce directamente esa huella energética. Este mismo razonamiento aplica, a menor escala, a cualquier campaña de validación de actuadores</w:t>
+      </w:r>
+      <w:r>
+        <w:t>.</w:t>
+      </w:r>
+      <w:r>
+        <w:t xml:space="preserve"> </w:t>
+      </w:r>
+      <w:r>
+        <w:t>C</w:t>
+      </w:r>
+      <w:r>
+        <w:t xml:space="preserve">ada hora de ensayo físico evitado mediante un banco de bajo consumo alimentado por cargas calculadas mediante simulación tiene una correlación directa en emisiones </w:t>
+      </w:r>
+      <w:r>
+        <w:t>evitadas. La</w:t>
+      </w:r>
+      <w:r>
+        <w:t xml:space="preserve"> industria aeroespacial enfrenta además una meta explícita de mitigación climática: el Plan de Acción Climática de </w:t>
+      </w:r>
+      <w:r>
+        <w:lastRenderedPageBreak/>
+        <w:t>la Aviación de Estados Unidos busca estabilizar las emisiones de CO</w:t>
+      </w:r>
+      <w:r>
+        <w:rPr>
+          <w:rFonts w:ascii="Cambria Math" w:hAnsi="Cambria Math" w:cs="Cambria Math"/>
+        </w:rPr>
+        <w:t>₂</w:t>
+      </w:r>
+      <w:r>
+        <w:t xml:space="preserve"> en el nivel de 2019 (~210 millones de toneladas m</w:t>
+      </w:r>
+      <w:r>
+        <w:rPr>
+          <w:rFonts w:cs="Arial"/>
+        </w:rPr>
+        <w:t>é</w:t>
+      </w:r>
+      <w:r>
+        <w:t xml:space="preserve">tricas), frente a una proyección sin intervención de hasta 450 millones de toneladas hacia 2050 </w:t>
+      </w:r>
+      <w:bookmarkStart w:id="17" w:name="ZOTERO_BREF_gitcQW9QFLdT"/>
+      <w:r>
+        <w:rPr>
+          <w:rFonts w:cs="Arial"/>
+        </w:rPr>
+        <w:t>[11]</w:t>
+      </w:r>
+      <w:bookmarkEnd w:id="17"/>
+      <w:r>
+        <w:t>. La simulación computacional y por extensión cualquier metodología que la aproveche más allá del diseño aerodinámico puro se identifica en esa misma literatura como una de las herramientas con potencial de contribuir a cerrar esa brecha, al reducir la necesidad de fabricar y desechar prototipos físicos sucesivos para cada iteración de diseño.</w:t>
+      </w:r>
+    </w:p>
+    <w:p>
+      <w:r>
+        <w:t xml:space="preserve">Más allá de la aplicación militar que generalmente motiva esta línea de investigación, las superficies de control actuadas son hoy un componente transversal de plataformas con impacto social directo. El mercado de drones civiles (agricultura de precisión, inspección de infraestructura, respuesta ante emergencias y monitoreo geológico) se proyecta en un rango de USD 15.000 a 33.000 millones para 2025-2026, con tasas de crecimiento anual de hasta 18 % </w:t>
+      </w:r>
+      <w:bookmarkStart w:id="18" w:name="ZOTERO_BREF_jpQIJvHhQ8Zy"/>
+      <w:r>
+        <w:rPr>
+          <w:rFonts w:cs="Arial"/>
+        </w:rPr>
+        <w:t>[8]</w:t>
+      </w:r>
+      <w:bookmarkEnd w:id="18"/>
+      <w:r>
+        <w:t>. Lo que refleja una adopción creciente de estos vehículos en tareas civiles con beneficio social directo, desde la agricultura hasta la gestión de desastres. La confiabilidad de los actuadores de superficies de control es en consecuencia relevante tanto para la seguridad de sistemas de defensa como para la de aplicaciones civiles que ya operan sobre población e infraestructura.</w:t>
+      </w:r>
+      <w:r>
+        <w:t xml:space="preserve"> </w:t>
+      </w:r>
+      <w:r>
+        <w:t>En el plano social más inmediato para este proyecto, el desarrollo de un banco de ensayos de bajo costo tiene valor como plataforma de docencia e investigación aplicada: permite formar a estudiantes en instrumentación, control y validación experimental sin requerir acceso a infraestructura de ensayo de alto costo, ampliando el acceso a este tipo de formación práctica en un contexto donde dicha infraestructura no está disponible de forma rutinaria.</w:t>
+      </w:r>
+    </w:p>
+    <w:p>
+      <w:r>
+        <w:t xml:space="preserve">La literatura revisada por este proyecto permite identificar tres familias de soluciones ya existentes. El Ensayo físico completo (túnel de viento / vuelo instrumentado) entrega la validación de mayor fidelidad, pero al costo y la escala de tiempo ya cuantificados en la sección anterior (entre cientos y miles de dólares por hora y meses de anticipación para reservar infraestructura). CFD y modelos sustitutos (surrogate </w:t>
+      </w:r>
+      <w:bookmarkStart w:id="19" w:name="ZOTERO_BREF_FTiEz1nYoYXE"/>
+      <w:r>
+        <w:t>models)</w:t>
+      </w:r>
+      <w:r>
+        <w:rPr>
+          <w:rFonts w:cs="Arial"/>
+        </w:rPr>
+        <w:t xml:space="preserve"> [</w:t>
+      </w:r>
+      <w:r>
+        <w:rPr>
+          <w:rFonts w:cs="Arial"/>
+        </w:rPr>
+        <w:t>2]</w:t>
+      </w:r>
+      <w:bookmarkEnd w:id="19"/>
+      <w:r>
+        <w:t>,</w:t>
+      </w:r>
+      <w:r>
+        <w:t xml:space="preserve"> </w:t>
+      </w:r>
+      <w:bookmarkStart w:id="20" w:name="ZOTERO_BREF_3jVlYIkPcwf2"/>
+      <w:r>
+        <w:rPr>
+          <w:rFonts w:cs="Arial"/>
+        </w:rPr>
+        <w:t>[13]</w:t>
+      </w:r>
+      <w:bookmarkEnd w:id="20"/>
+      <w:r>
+        <w:t>,</w:t>
+      </w:r>
+      <w:r>
+        <w:t xml:space="preserve"> </w:t>
+      </w:r>
+      <w:bookmarkStart w:id="21" w:name="ZOTERO_BREF_iO3MUyjoHw8g"/>
+      <w:r>
+        <w:rPr>
+          <w:rFonts w:cs="Arial"/>
+        </w:rPr>
+        <w:t>[14]</w:t>
+      </w:r>
+      <w:bookmarkEnd w:id="21"/>
+      <w:r>
+        <w:t xml:space="preserve"> y</w:t>
+      </w:r>
+      <w:r>
+        <w:t xml:space="preserve"> </w:t>
+      </w:r>
+      <w:bookmarkStart w:id="22" w:name="ZOTERO_BREF_2j90Q4F2zscy"/>
+      <w:r>
+        <w:rPr>
+          <w:rFonts w:cs="Arial"/>
+        </w:rPr>
+        <w:t>[3]</w:t>
+      </w:r>
+      <w:bookmarkEnd w:id="22"/>
+      <w:r>
+        <w:t xml:space="preserve"> demuestran que es posible generar tablas de carga aerodinámica multidimensionales con un número acotado de simulaciones y errores de interpolación bajos, resolviendo el problema de generar la carga, pero no el de aplicarla físicamente sobre un actuador candidato. Los simuladores de carga y bancos de ensayo dinámicos</w:t>
+      </w:r>
+      <w:r>
+        <w:t xml:space="preserve"> </w:t>
+      </w:r>
+      <w:bookmarkStart w:id="23" w:name="ZOTERO_BREF_JCs7Q32AoomB"/>
+      <w:r>
+        <w:rPr>
+          <w:rFonts w:cs="Arial"/>
+        </w:rPr>
+        <w:t>[15]</w:t>
+      </w:r>
+      <w:bookmarkEnd w:id="23"/>
+      <w:r>
+        <w:rPr>
+          <w:rFonts w:cs="Arial"/>
+        </w:rPr>
+        <w:t xml:space="preserve">, </w:t>
+      </w:r>
+      <w:bookmarkStart w:id="24" w:name="ZOTERO_BREF_S3YT3GZJXvK2"/>
+      <w:r>
+        <w:rPr>
+          <w:rFonts w:cs="Arial"/>
+        </w:rPr>
+        <w:t>[16]</w:t>
+      </w:r>
+      <w:bookmarkEnd w:id="24"/>
+      <w:r>
+        <w:rPr>
+          <w:rFonts w:cs="Arial"/>
+        </w:rPr>
+        <w:t xml:space="preserve">, </w:t>
+      </w:r>
+      <w:bookmarkStart w:id="25" w:name="ZOTERO_BREF_N3ceS6RPYzps"/>
+      <w:r>
+        <w:rPr>
+          <w:rFonts w:cs="Arial"/>
+        </w:rPr>
+        <w:t>[17]</w:t>
+      </w:r>
+      <w:bookmarkEnd w:id="25"/>
+      <w:r>
+        <w:rPr>
+          <w:rFonts w:cs="Arial"/>
+        </w:rPr>
+        <w:t xml:space="preserve">, </w:t>
+      </w:r>
+      <w:bookmarkStart w:id="26" w:name="ZOTERO_BREF_8GXUYAgyyPyZ"/>
+      <w:r>
+        <w:rPr>
+          <w:rFonts w:cs="Arial"/>
+        </w:rPr>
+        <w:t>[18]</w:t>
+      </w:r>
+      <w:bookmarkEnd w:id="26"/>
+      <w:r>
+        <w:t xml:space="preserve"> resuelven el problema de aplicar una carga controlada sobre un actuador, pero casi en su totalidad a escala hidráulica y de cientos a miles de Nm, orientada a la industria aeroespacial de gran escala. El antecedente de menor escala y objetivo más cercano (</w:t>
+      </w:r>
+      <w:bookmarkStart w:id="27" w:name="ZOTERO_BREF_F4YsipiTrDIS"/>
+      <w:r>
+        <w:rPr>
+          <w:rFonts w:cs="Arial"/>
+        </w:rPr>
+        <w:t>[4]</w:t>
+      </w:r>
+      <w:bookmarkEnd w:id="27"/>
+      <w:r>
+        <w:t>) sigue siendo un caso aislado y no una metodología de bajo costo ya estandarizada.</w:t>
+      </w:r>
+    </w:p>
+    <w:p>
+      <w:r>
+        <w:t>La brecha específica que se debe abordar es la combinación de: escala pequeña y bajo costo (componentes COTS, torque muy por debajo de la literatura de simuladores de carga de gran escala</w:t>
+      </w:r>
+      <w:r>
+        <w:t>) y</w:t>
+      </w:r>
+      <w:r>
+        <w:t xml:space="preserve"> recálculo del torque objetivo en tiempo real a partir de la posición y velocidad angular reales de la superficie de control. Ninguna de </w:t>
+      </w:r>
+      <w:r>
+        <w:t>las referencias</w:t>
+      </w:r>
+      <w:r>
+        <w:t xml:space="preserve"> revisadas replica esta combinación como conjunto, lo que constituye tanto la brecha diagnosticada como el espacio de contribución de esta memoria.</w:t>
+      </w:r>
+    </w:p>
+    <w:p>
+      <w:r>
+        <w:t>La evidencia reunida en las dimensiones anteriores converge en una misma conclusión.</w:t>
+      </w:r>
+      <w:r>
+        <w:t xml:space="preserve"> D</w:t>
+      </w:r>
+      <w:r>
+        <w:t>esarrollar un banco de ensayos capaz de traducir cargas obtenidas</w:t>
+      </w:r>
+      <w:r>
+        <w:t xml:space="preserve"> de simulación </w:t>
+      </w:r>
+      <w:r>
+        <w:lastRenderedPageBreak/>
+        <w:t>computacional</w:t>
+      </w:r>
+      <w:r>
+        <w:t xml:space="preserve"> en condiciones físicas reproducibles sobre un actuador de superficies de control, a una escala y costo accesibles para un laboratorio universitario, no solo llena un vacío metodológico documentado en la literatura, sino que responde a una necesidad cuantificable en los cuatro ámbitos examinados. Ese es el problema concreto que esta memoria de título busca abordar.</w:t>
+      </w:r>
+    </w:p>
+    <w:p/>
+    <w:p>
+      <w:pPr>
+        <w:pStyle w:val="Ttulo2"/>
+      </w:pPr>
+      <w:bookmarkStart w:id="28" w:name="_Toc239978846"/>
+      <w:r>
+        <w:t>Hipótesis</w:t>
+      </w:r>
+      <w:bookmarkEnd w:id="28"/>
+    </w:p>
+    <w:p>
+      <w:r>
+        <w:t>La implementación de un banco de ensayos basado en cargas fluidodinámicas equivalentes permitirá evaluar experimentalmente actuadores de superficies de control, proporcionando parámetros de desempeño que pueden ser utilizados como apoyo al proceso de dimensionamiento y selección de estos componentes.</w:t>
+      </w:r>
+    </w:p>
+    <w:p>
+      <w:pPr>
+        <w:pStyle w:val="Ttulo2"/>
+      </w:pPr>
+      <w:bookmarkStart w:id="29" w:name="_Toc239978847"/>
+      <w:r>
+        <w:t>Objetivos</w:t>
+      </w:r>
+      <w:bookmarkEnd w:id="29"/>
+    </w:p>
+    <w:p>
+      <w:pPr>
+        <w:rPr>
+          <w:color w:val="000000" w:themeColor="text1"/>
+        </w:rPr>
+      </w:pPr>
+      <w:r>
+        <w:rPr>
+          <w:color w:val="000000" w:themeColor="text1"/>
+        </w:rPr>
+        <w:t>OG: Diseñar e implementar un banco de ensayos para la verificación y caracterización de actuadores COTS de superficies de control utilizando cargas fluidodinámicas obtenidas mediante simulación Computacional.</w:t>
+      </w:r>
+    </w:p>
+    <w:p>
+      <w:pPr>
+        <w:pStyle w:val="Ttulo3"/>
+      </w:pPr>
+      <w:bookmarkStart w:id="30" w:name="_Toc239978848"/>
+      <w:r>
+        <w:t>Objetivos específicos</w:t>
+      </w:r>
+      <w:bookmarkEnd w:id="30"/>
+    </w:p>
+    <w:p>
+      <w:r>
+        <w:t xml:space="preserve">OE1: </w:t>
+      </w:r>
+      <w:r>
+        <w:rPr>
+          <w:b/>
+          <w:bCs/>
+        </w:rPr>
+        <w:t>Concebir</w:t>
+      </w:r>
+      <w:r>
+        <w:t xml:space="preserve"> un diseño preliminar en base del estado del arte de actuadores, bancos de ensayo y metodologías de simulación computacional relevantes para el proyecto.</w:t>
+      </w:r>
+    </w:p>
+    <w:p>
+      <w:r>
+        <w:t xml:space="preserve">OE2: </w:t>
+      </w:r>
+      <w:r>
+        <w:rPr>
+          <w:b/>
+          <w:bCs/>
+        </w:rPr>
+        <w:t>Desarrollar</w:t>
+      </w:r>
+      <w:r>
+        <w:t xml:space="preserve"> una metodología para obtener y procesar cargas fluidodinámicas mediante simulaciones computacionales.</w:t>
+      </w:r>
+    </w:p>
+    <w:p>
+      <w:r>
+        <w:t xml:space="preserve">OE3: </w:t>
+      </w:r>
+      <w:r>
+        <w:rPr>
+          <w:b/>
+          <w:bCs/>
+        </w:rPr>
+        <w:t>Diseñar</w:t>
+      </w:r>
+      <w:r>
+        <w:t xml:space="preserve"> la arquitectura mecánica, electrónica, de software y de control de la plataforma experimental.</w:t>
+      </w:r>
+    </w:p>
+    <w:p>
+      <w:r>
+        <w:t xml:space="preserve">OE4: </w:t>
+      </w:r>
+      <w:r>
+        <w:rPr>
+          <w:b/>
+          <w:bCs/>
+        </w:rPr>
+        <w:t>Implementar</w:t>
+      </w:r>
+      <w:r>
+        <w:t xml:space="preserve"> el banco de ensayos y </w:t>
+      </w:r>
+      <w:r>
+        <w:rPr>
+          <w:b/>
+          <w:bCs/>
+        </w:rPr>
+        <w:t>Verificar</w:t>
+      </w:r>
+      <w:r>
+        <w:t xml:space="preserve"> la plataforma experimental mediante ensayos de actuadores de superficies de control.</w:t>
+      </w:r>
+    </w:p>
+    <w:p>
+      <w:pPr>
+        <w:rPr>
+          <w:color w:val="000000" w:themeColor="text1"/>
+        </w:rPr>
+      </w:pPr>
+    </w:p>
+    <w:p>
+      <w:pPr>
+        <w:pStyle w:val="Ttulo1"/>
+      </w:pPr>
+      <w:bookmarkStart w:id="31" w:name="_Toc239978849"/>
+      <w:r>
+        <w:t>Metodología</w:t>
+      </w:r>
+      <w:bookmarkEnd w:id="31"/>
+    </w:p>
+    <w:p>
+      <w:pPr>
+        <w:rPr>
+          <w:color w:val="000000" w:themeColor="text1"/>
+        </w:rPr>
+      </w:pPr>
+      <w:r>
+        <w:rPr>
+          <w:color w:val="000000" w:themeColor="text1"/>
+        </w:rPr>
+        <w:t>El presente trabajo se estructurará en torno a los cuatro objetivos específicos planteados, desarrollando actividades que irán desde la revisión bibliográfica hasta la implementación y verificación experimental del banco de ensayos.</w:t>
+      </w:r>
+    </w:p>
+    <w:p>
+      <w:pPr>
+        <w:rPr>
+          <w:color w:val="000000" w:themeColor="text1"/>
+        </w:rPr>
+      </w:pPr>
+      <w:r>
+        <w:rPr>
+          <w:color w:val="000000" w:themeColor="text1"/>
+        </w:rPr>
+        <w:t xml:space="preserve">En relación con el OE1 (Concebir un diseño preliminar), se realizará una revisión exhaustiva del estado del arte abarcando tres áreas principales: actuadores COTS para superficies de control, identificando rangos típicos de torque de bisagra, velocidades angulares y arquitecturas de control. Bancos de ensayo existentes para caracterización de actuadores, analizando tanto soluciones industriales de gran escala como el antecedente más cercano en escala reducida. Y metodologías de simulación computacional para generación de bases de datos aerodinámicos, con énfasis en técnicas de muestreo adaptativo y modelos de </w:t>
+      </w:r>
+      <w:r>
+        <w:rPr>
+          <w:color w:val="000000" w:themeColor="text1"/>
+        </w:rPr>
+        <w:lastRenderedPageBreak/>
+        <w:t>orden reducido. Como producto de esta revisión, se definirán los requisitos funcionales del banco: capacidad de aplicar torque variable en tiempo real en el rango a definir, resolución angular, frecuencia de actualización de carga, y arquitectura basada en componentes comerciales de bajo costo.</w:t>
+      </w:r>
+    </w:p>
+    <w:p>
+      <w:pPr>
+        <w:rPr>
+          <w:color w:val="000000" w:themeColor="text1"/>
+        </w:rPr>
+      </w:pPr>
+      <w:r>
+        <w:rPr>
+          <w:color w:val="000000" w:themeColor="text1"/>
+        </w:rPr>
+        <w:t>Para el OE2 (Desarrollar metodología de obtención de cargas fluidodinámicas), se establecerá un flujo de trabajo que partirá de la definición de un caso de estudio representativo: una superficie de control tipo con perfil NACA 0012, cuerda de 50 mm y envergadura de 80 mm. Mediante simulaciones en régimen subsónico, se generará una base de datos multidimensional del coeficiente de momento de bisagra (Ch) en función del ángulo de ataque (α) y deflexión de la superficie de control (δ). Se implementará un procedimiento de interpolación basado en modelos de orden reducido que permitirá calcular el torque instantáneo para cualquier combinación de α y δ durante el ensayo.</w:t>
+      </w:r>
+    </w:p>
+    <w:p>
+      <w:r>
+        <w:t>El OE3 (Diseñar la arquitectura del banco) se abordará mediante el desarrollo integrado de cuatro subsistemas: Arquitectura mecánica, comprendiendo el sistema de transmisión de torque, soportes estructurales y acoples al actuador bajo prueba. Arquitectura electrónica, incluyendo selección de motor de carga, driver, sensor de torque, encoder angular y unidad de procesamiento. Arquitectura de software, con desarrollo de firmware para adquisición de señales y cálculo de torque objetivo en tiempo real. Y estrategia de control, diseñada para seguir la referencia de torque calculada a partir de la posición y velocidad angular medidas, compensando las dinámicas propias del motor de carga y el eje.</w:t>
+      </w:r>
+    </w:p>
+    <w:p>
+      <w:pPr>
+        <w:rPr>
+          <w:color w:val="000000" w:themeColor="text1"/>
+        </w:rPr>
+      </w:pPr>
+      <w:r>
+        <w:rPr>
+          <w:color w:val="000000" w:themeColor="text1"/>
+        </w:rPr>
+        <w:t>Finalmente, para el OE4 (Implementar y verificar el banco) se contempla la fabricación de prototipos, integración de subsistemas, calibración de instrumentación y ejecución de ensayos de validación. La verificación se realizará comparando el torque aplicado versus el torque teórico calculado por simulación para trayectorias predefinidas de α y δ, evaluando métricas de desempeño como error RMS, tiempo de estabilización y sobreimpulso. Los resultados permitirán caracterizar el actuador bajo condiciones representativas de operación y validar la hipótesis planteada.</w:t>
+      </w:r>
     </w:p>
     <w:p>
       <w:pPr>
         <w:spacing w:after="160" w:line="259" w:lineRule="auto"/>
         <w:jc w:val="left"/>
         <w:rPr>
-          <w:b/>
-          <w:bCs/>
-          <w:sz w:val="32"/>
-          <w:szCs w:val="32"/>
-        </w:rPr>
-      </w:pPr>
-      <w:r>
-        <w:rPr>
-          <w:b/>
-          <w:bCs/>
-          <w:sz w:val="32"/>
-          <w:szCs w:val="32"/>
+          <w:color w:val="000000" w:themeColor="text1"/>
+        </w:rPr>
+      </w:pPr>
+      <w:r>
+        <w:rPr>
+          <w:color w:val="000000" w:themeColor="text1"/>
         </w:rPr>
         <w:br w:type="page"/>
       </w:r>
     </w:p>
-    <w:p>
-      <w:pPr>
-        <w:pStyle w:val="Ttulo1"/>
-        <w:numPr>
-          <w:ilvl w:val="0"/>
-          <w:numId w:val="0"/>
-        </w:numPr>
-        <w:ind w:left="432" w:hanging="432"/>
-      </w:pPr>
-      <w:bookmarkStart w:id="2" w:name="_Toc239894267"/>
-      <w:r>
-        <w:lastRenderedPageBreak/>
-        <w:t>Nomenclatura</w:t>
-      </w:r>
-      <w:bookmarkEnd w:id="2"/>
-    </w:p>
-    <w:p>
-      <w:pPr>
-        <w:spacing w:after="160" w:line="259" w:lineRule="auto"/>
-        <w:jc w:val="left"/>
-        <w:rPr>
-          <w:b/>
-          <w:bCs/>
-          <w:sz w:val="32"/>
-          <w:szCs w:val="32"/>
-        </w:rPr>
-      </w:pPr>
-      <w:r>
-        <w:rPr>
-          <w:b/>
-          <w:bCs/>
-          <w:sz w:val="32"/>
-          <w:szCs w:val="32"/>
-        </w:rPr>
-        <w:br w:type="page"/>
-      </w:r>
-    </w:p>
-    <w:p>
-      <w:pPr>
-        <w:pStyle w:val="Ttulo1"/>
-      </w:pPr>
-      <w:bookmarkStart w:id="3" w:name="_Toc239894268"/>
-      <w:r>
-        <w:lastRenderedPageBreak/>
-        <w:t>Introducción</w:t>
-      </w:r>
-      <w:bookmarkEnd w:id="3"/>
-    </w:p>
-    <w:p>
-      <w:pPr>
-        <w:pStyle w:val="Ttulo2"/>
-      </w:pPr>
-      <w:bookmarkStart w:id="4" w:name="_Toc239894269"/>
-      <w:r>
-        <w:t>Contexto</w:t>
-      </w:r>
-      <w:bookmarkEnd w:id="4"/>
-    </w:p>
-    <w:p>
-      <w:pPr>
-        <w:rPr>
-          <w:highlight w:val="yellow"/>
-        </w:rPr>
-      </w:pPr>
-      <w:r>
-        <w:rPr>
-          <w:highlight w:val="yellow"/>
-        </w:rPr>
-        <w:t xml:space="preserve">El contexto, abarcando ya sea la pregunta de investigación o la declaración del problema, sirve como la base de </w:t>
-      </w:r>
-      <w:r>
-        <w:rPr>
-          <w:highlight w:val="yellow"/>
-        </w:rPr>
-        <w:t>un estudio técnico o científico</w:t>
-      </w:r>
-      <w:r>
-        <w:rPr>
-          <w:highlight w:val="yellow"/>
-        </w:rPr>
-        <w:t>. Se define el alcance, la importancia y la orientación de la investigación, guiando todo el estudio. Crear un contexto convincente y claro es crucial, ya que no solo informa a los lectores sobre el propósito de la investigación, sino que también establece la necesidad y relevancia de la investigación.</w:t>
-      </w:r>
-    </w:p>
-    <w:p>
-      <w:pPr>
-        <w:rPr>
-          <w:highlight w:val="yellow"/>
-        </w:rPr>
-      </w:pPr>
-      <w:r>
-        <w:rPr>
-          <w:highlight w:val="yellow"/>
-        </w:rPr>
-        <w:t>Se comienza resumiendo el estado actual del conocimiento en su campo de estudio (estado del arte). Aquí, se destacan las investigaciones existentes y se señalan las brechas o preguntas sin responder que el estudio pretende abordar. Este enfoque no solo prepara el escenario para la investigación, sino que también demuestra su necesidad y contribución potencial al campo.</w:t>
-      </w:r>
-    </w:p>
-    <w:p>
-      <w:pPr>
-        <w:rPr>
-          <w:highlight w:val="yellow"/>
-        </w:rPr>
-      </w:pPr>
-      <w:r>
-        <w:rPr>
-          <w:highlight w:val="yellow"/>
-        </w:rPr>
-        <w:t xml:space="preserve">El estudio bibliográfico del estado del arte debe realizarse en base a referencias a libros, artículos, presentaciones y/o páginas web, entre otros. Cualquier referencia deberá ser citada dentro del texto y luego ser incluida en el listado de referencias. Se recomienda utilizar una norma de citación estándar como la APA o IEEE. Por ejemplo, </w:t>
-      </w:r>
-      <w:r>
-        <w:rPr>
-          <w:highlight w:val="yellow"/>
-        </w:rPr>
-        <w:t xml:space="preserve">en cierta referencia hacen una modelación dinámica de instrumentos musicales </w:t>
-      </w:r>
-      <w:sdt>
-        <w:sdtPr>
-          <w:rPr>
-            <w:highlight w:val="yellow"/>
-          </w:rPr>
-          <w:id w:val="-2126996859"/>
-          <w:citation/>
-        </w:sdtPr>
-        <w:sdtContent>
-          <w:r>
-            <w:rPr>
-              <w:highlight w:val="yellow"/>
-            </w:rPr>
-            <w:fldChar w:fldCharType="begin"/>
-          </w:r>
-          <w:r>
-            <w:rPr>
-              <w:highlight w:val="yellow"/>
-            </w:rPr>
-            <w:instrText xml:space="preserve"> CITATION Fra14 \l 13322 </w:instrText>
-          </w:r>
-          <w:r>
-            <w:rPr>
-              <w:highlight w:val="yellow"/>
-            </w:rPr>
-            <w:fldChar w:fldCharType="separate"/>
-          </w:r>
-          <w:r>
-            <w:rPr>
-              <w:noProof/>
-              <w:highlight w:val="yellow"/>
-            </w:rPr>
-            <w:t>(Sorge, 2014)</w:t>
-          </w:r>
-          <w:r>
-            <w:rPr>
-              <w:highlight w:val="yellow"/>
-            </w:rPr>
-            <w:fldChar w:fldCharType="end"/>
-          </w:r>
-        </w:sdtContent>
-      </w:sdt>
-      <w:r>
-        <w:rPr>
-          <w:highlight w:val="yellow"/>
-        </w:rPr>
-        <w:t>.</w:t>
-      </w:r>
-    </w:p>
-    <w:p>
-      <w:pPr>
-        <w:rPr>
-          <w:highlight w:val="yellow"/>
-        </w:rPr>
-      </w:pPr>
-      <w:r>
-        <w:rPr>
-          <w:highlight w:val="yellow"/>
-        </w:rPr>
-        <w:t>Después de establecer la brecha, se articula la pregunta de investigación o declaración del problema a resolver según sea el caso. Esto debería abordar directamente la brecha identificada, especificando lo que la investigación investigará o resolverá. Uno debe asegurarse que la pregunta o problema sea enfocado, investigable y significativo para el campo de estudio.</w:t>
-      </w:r>
-    </w:p>
-    <w:p>
-      <w:pPr>
-        <w:rPr>
-          <w:highlight w:val="yellow"/>
-        </w:rPr>
-      </w:pPr>
-      <w:r>
-        <w:rPr>
-          <w:highlight w:val="yellow"/>
-        </w:rPr>
-        <w:t xml:space="preserve">Luego, se debe explicar por qué la pregunta de investigación o problema es importante de abordar. Se discuten las implicaciones potenciales de su estudio y cómo podría contribuir al campo o aplicarse a problemas del mundo real. Esta justificación establece el valor y la contribución del estudio. Poner cuidado en que la pregunta de investigación o declaración del problema sea lo suficientemente específica para ser manejable dentro del alcance </w:t>
-      </w:r>
-      <w:r>
-        <w:rPr>
-          <w:highlight w:val="yellow"/>
-        </w:rPr>
-        <w:t>del estudio</w:t>
-      </w:r>
-      <w:r>
-        <w:rPr>
-          <w:highlight w:val="yellow"/>
-        </w:rPr>
-        <w:t xml:space="preserve">. </w:t>
-      </w:r>
-    </w:p>
-    <w:p>
-      <w:r>
-        <w:rPr>
-          <w:highlight w:val="yellow"/>
-        </w:rPr>
-        <w:t>Al elaborar el contexto, el foco es involucrar a los lectores presentando una narrativa clara y convincente que destaque la importancia de su investigación y cómo llena una brecha específica en el estado del arte. Este elemento fundamental establece el tono para todo el estudio, guiando la dirección de la investigación e informando su metodología y análisis.</w:t>
-      </w:r>
-    </w:p>
-    <w:p/>
-    <w:p/>
-    <w:p/>
-    <w:p/>
-    <w:p/>
-    <w:p/>
-    <w:p>
-      <w:r>
-        <w:lastRenderedPageBreak/>
-        <w:t>El diseño de vehículos aeroespaciales con superficies de control (misiles, UAV y otros sistemas con aletas, elevadores o alerones) depende de forma crítica de una etapa que rara vez recibe la misma atención que la aerodinámica o la estructura: la validación física del actuador que finalmente moverá dichas superficies bajo las cargas reales de operación. Durante décadas, esa validación se apoyó casi exclusivamente en el ensayo en túnel de viento y en el vuelo instrumentado, ambos de alto costo y baja flexibilidad. La irrupción de la simulación computacional como herramienta madura de predicción de cargas (capaz hoy de sustituir buena parte, aunque no la totalidad, de esas campañas físicas) abre una posibilidad concreta: generar cargas aerodinámicas confiables por simulación y usarlas para caracterizar y poner a prueba actuadores antes de integrarlos en un vehículo completo. Sin embargo, entre la tabla de cargas que entrega una simulación computacional y el actuador físico que debe reproducir esas condiciones existe una brecha metodológica poco resuelta, particularmente para organizaciones</w:t>
-      </w:r>
-      <w:r>
-        <w:t xml:space="preserve"> </w:t>
-      </w:r>
-      <w:r>
-        <w:t xml:space="preserve">que no cuentan con acceso rutinario a un túnel de viento </w:t>
-      </w:r>
-      <w:r>
-        <w:t>adecuado. En esta sección se</w:t>
-      </w:r>
-      <w:r>
-        <w:t xml:space="preserve"> desarrolla por qué esa brecha es relevante de cerrar y qué evidencia cuantitativa la respalda.</w:t>
-      </w:r>
-    </w:p>
-    <w:p>
-      <w:r>
-        <w:t xml:space="preserve">La sofisticación de las superficies de control ha crecido en paralelo a la industria que las utiliza. </w:t>
-      </w:r>
-      <w:bookmarkStart w:id="5" w:name="ZOTERO_BREF_j71xDLKcmJ6Z"/>
-      <w:r>
-        <w:rPr>
-          <w:rFonts w:cs="Arial"/>
-        </w:rPr>
-        <w:t>[1]</w:t>
-      </w:r>
-      <w:bookmarkEnd w:id="5"/>
-      <w:r>
-        <w:t xml:space="preserve"> documenta cómo la predicción del momento de bisagra (la carga que un actuador debe vencer) ha evolucionado desde relaciones semi-empíricas (Datcom) hacia CFD viscoso de alta fidelidad, mientras que</w:t>
-      </w:r>
-      <w:r>
-        <w:t xml:space="preserve"> </w:t>
-      </w:r>
-      <w:bookmarkStart w:id="6" w:name="ZOTERO_BREF_J8t4ZwDeosRD"/>
-      <w:r>
-        <w:rPr>
-          <w:rFonts w:cs="Arial"/>
-        </w:rPr>
-        <w:t>[2]</w:t>
-      </w:r>
-      <w:bookmarkEnd w:id="6"/>
-      <w:r>
-        <w:t xml:space="preserve"> y</w:t>
-      </w:r>
-      <w:r>
-        <w:t xml:space="preserve"> </w:t>
-      </w:r>
-      <w:bookmarkStart w:id="7" w:name="ZOTERO_BREF_QC5oULHURREB"/>
-      <w:r>
-        <w:rPr>
-          <w:rFonts w:cs="Arial"/>
-        </w:rPr>
-        <w:t>[3]</w:t>
-      </w:r>
-      <w:bookmarkEnd w:id="7"/>
-      <w:r>
-        <w:t xml:space="preserve"> muestran que ya es posible generar bases de datos aerodinámicas multidimensionales a partir de un número acotado de simulaciones, con errores de interpolación reportados por debajo del 1 % en modelos de orden reducido para misiles subsónicos. El eslabón que sigue sin estandarizarse es precisamente el que traduce esa tabla de cargas en un ensayo físico sobre el actuador candidato: </w:t>
-      </w:r>
-      <w:bookmarkStart w:id="8" w:name="ZOTERO_BREF_ijX0cLB6825I"/>
-      <w:r>
-        <w:rPr>
-          <w:rFonts w:cs="Arial"/>
-        </w:rPr>
-        <w:t>[4]</w:t>
-      </w:r>
-      <w:bookmarkEnd w:id="8"/>
-      <w:r>
-        <w:rPr>
-          <w:rFonts w:cs="Arial"/>
-        </w:rPr>
-        <w:t xml:space="preserve"> </w:t>
-      </w:r>
-      <w:r>
-        <w:t>son el antecedente más cercano, un banco tipo dinamómetro que aplica torque de carga sobre el eje de bisagra de un servoactuador de UAV. Pero permanece como un caso aislado, no como una metodología replicada ampliamente.</w:t>
-      </w:r>
-      <w:r>
-        <w:t xml:space="preserve"> </w:t>
-      </w:r>
-      <w:r>
-        <w:t xml:space="preserve">La urgencia tecnológica de resolver esta brecha se aprecia también en las cifras de seguridad de vuelo. Según </w:t>
-      </w:r>
-      <w:bookmarkStart w:id="9" w:name="ZOTERO_BREF_2k1ZKBE6D55m"/>
-      <w:r>
-        <w:rPr>
-          <w:rFonts w:cs="Arial"/>
-        </w:rPr>
-        <w:t>[5]</w:t>
-      </w:r>
-      <w:bookmarkEnd w:id="9"/>
-      <w:r>
-        <w:t xml:space="preserve"> la pérdida de control en vuelo (Loss of Control, LOC) fue la causa individual con más víctimas fatales en la aviación comercial entre 2008 y 2017, con 14 accidentes y 1.129 fallecidos. Las fallas de actuadores y de superficies de control figuran de forma explícita entre los modos de falla que derivan en pérdida de control, tanto en aviación tripulada como en UAV</w:t>
-      </w:r>
-      <w:r>
-        <w:t xml:space="preserve"> </w:t>
-      </w:r>
-      <w:bookmarkStart w:id="10" w:name="ZOTERO_BREF_xEmrBpvpW2UM"/>
-      <w:r>
-        <w:rPr>
-          <w:rFonts w:cs="Arial"/>
-        </w:rPr>
-        <w:t>[6]</w:t>
-      </w:r>
-      <w:bookmarkEnd w:id="10"/>
-      <w:r>
-        <w:t>.</w:t>
-      </w:r>
-    </w:p>
-    <w:p>
-      <w:r>
-        <w:t xml:space="preserve">La magnitud económica del sector que consume esta tecnología es sustancial y sigue creciendo tanto en su vertiente militar como en su vertiente civil. Por el lado militar, el mercado global de municiones guiadas de precisión, la aplicación típica de superficies de control </w:t>
-      </w:r>
-      <w:r>
-        <w:t>actuadas</w:t>
-      </w:r>
-      <w:r>
-        <w:t xml:space="preserve"> se valoró en aproximadamente USD 36.500 millones en 2024, con proyecciones de crecimiento a una tasa anual compuesta cercana al 5 % hasta superar los USD 59.000 millones hacia 2034</w:t>
-      </w:r>
-      <w:r>
-        <w:t xml:space="preserve"> </w:t>
-      </w:r>
-      <w:bookmarkStart w:id="11" w:name="ZOTERO_BREF_7wDCmXQ32UHB"/>
-      <w:r>
-        <w:rPr>
-          <w:rFonts w:cs="Arial"/>
-        </w:rPr>
-        <w:t>[7]</w:t>
-      </w:r>
-      <w:bookmarkEnd w:id="11"/>
-      <w:r>
-        <w:t>. Por el lado civil y comercial, el mercado de drones para agricultura de precisión, inspección de infraestructura, logística y monitoreo ambiental se valoró entre USD 12.500 y 15.000 millones en 2025-2026, con una tasa de crecimiento anual proyectada de hasta 18,6 %, sustancialmente más rápida que el crecimiento del segmento militar, y se espera que alcance entre USD 69.000 y 96.000 millones hacia comienzos de la próxima década</w:t>
-      </w:r>
-      <w:r>
-        <w:t xml:space="preserve"> </w:t>
-      </w:r>
-      <w:bookmarkStart w:id="12" w:name="ZOTERO_BREF_PzuYSVYkpOjO"/>
-      <w:r>
-        <w:rPr>
-          <w:rFonts w:cs="Arial"/>
-        </w:rPr>
-        <w:t>[8]</w:t>
-      </w:r>
-      <w:bookmarkEnd w:id="12"/>
-      <w:r>
-        <w:t>. El mercado agregado de UAV (que combina ambos usos) confirma esta tendencia: se sitúa entre USD 26.000 y 40.000 millones en 2025, y el propio segmento comercial es señalado por</w:t>
-      </w:r>
-      <w:r>
-        <w:t xml:space="preserve"> </w:t>
-      </w:r>
-      <w:bookmarkStart w:id="13" w:name="ZOTERO_BREF_502sMrmdBj9v"/>
-      <w:r>
-        <w:rPr>
-          <w:rFonts w:cs="Arial"/>
-        </w:rPr>
-        <w:t>[9]</w:t>
-      </w:r>
-      <w:bookmarkEnd w:id="13"/>
-      <w:r>
-        <w:t xml:space="preserve"> como el de mayor tasa de crecimiento dentro </w:t>
-      </w:r>
-      <w:r>
-        <w:lastRenderedPageBreak/>
-        <w:t xml:space="preserve">de esa cifra total (25,4 % proyectado a 2030 por sobre el segmento de defensa). En ambos casos (el civil y militar) el actuador de la superficie de control es un componente </w:t>
-      </w:r>
-      <w:r>
-        <w:t>común</w:t>
-      </w:r>
-      <w:r>
-        <w:t>, por lo que el problema de caracterizarlo bajo carga representativa no es exclusivo de una sola industria, sino transversal a ambas.</w:t>
-      </w:r>
-      <w:r>
-        <w:t xml:space="preserve"> </w:t>
-      </w:r>
-      <w:r>
-        <w:t>Esa escala económica, civil y militar por igual, convive con un costo de validación experimental que sigue siendo alto para cualquiera de las dos aplicaciones. El ensayo en túnel de viento tiene un costo típico de entre USD 200 y 1.000 por hora para instalaciones convencionales, y puede superar los USD 20.000 por hora en túneles de gran escala, sin contar el costo de fabricación de un modelo físico instrumentado, que puede alcanzar el millón de dólares</w:t>
-      </w:r>
-      <w:r>
-        <w:t xml:space="preserve"> </w:t>
-      </w:r>
-      <w:bookmarkStart w:id="14" w:name="ZOTERO_BREF_j4gwILHuPfne"/>
-      <w:r>
-        <w:rPr>
-          <w:rFonts w:cs="Arial"/>
-        </w:rPr>
-        <w:t>[10]</w:t>
-      </w:r>
-      <w:bookmarkEnd w:id="14"/>
-      <w:r>
-        <w:t xml:space="preserve">. Este costo golpea de forma proporcionalmente mayor a los desarrolladores de UAV comerciales y a los equipos de investigación </w:t>
-      </w:r>
-      <w:r>
-        <w:t>aplicada, que</w:t>
-      </w:r>
-      <w:r>
-        <w:t xml:space="preserve"> operan con presupuestos muy inferiores a los de un programa de defensa. La incorporación temprana de simulación computacional ya ha demostrado, en la práctica industrial civil y militar, una reducción de hasta un 60 % en costos y de hasta un 80 % en tiempo de desarrollo en casos documentados, y Boeing redujo el número de ensayos en túnel de viento necesarios para el diseño de alas de aeronaves comerciales de 77 en la década de 1970 a solo 10 hacia fines de los años noventa (una reducción del 87 %) gracias a la adopción progresiva de CFD</w:t>
-      </w:r>
-      <w:r>
-        <w:t xml:space="preserve"> </w:t>
-      </w:r>
-      <w:bookmarkStart w:id="15" w:name="ZOTERO_BREF_qczaH9J2IZhE"/>
-      <w:r>
-        <w:rPr>
-          <w:rFonts w:cs="Arial"/>
-        </w:rPr>
-        <w:t>[11]</w:t>
-      </w:r>
-      <w:bookmarkEnd w:id="15"/>
-      <w:r>
-        <w:t>.</w:t>
-      </w:r>
-      <w:r>
-        <w:t xml:space="preserve"> </w:t>
-      </w:r>
-      <w:r>
-        <w:t xml:space="preserve">Este problema tiene además una dimensión económica local concreta que combina ambas vertientes. Según el informe SIPRI 2025, Chile es el cuarto país de mayor gasto en defensa de América Latina, con USD 5.105 millones en 2024, y la Fuerza Aérea de Chile proyecta la incorporación de una flota de entre 12 y 36 vehículos aéreos no tripulados de combate hacia el período 2025-2026 </w:t>
-      </w:r>
-      <w:bookmarkStart w:id="16" w:name="ZOTERO_BREF_OMrL5Yu3fLL6"/>
-      <w:r>
-        <w:rPr>
-          <w:rFonts w:cs="Arial"/>
-        </w:rPr>
-        <w:t>[12]</w:t>
-      </w:r>
-      <w:bookmarkEnd w:id="16"/>
-      <w:r>
-        <w:t>. En paralelo, el país es también un mercado creciente de UAV civiles para minería, agricultura y monitoreo geográfico, sectores relevantes para la economía nacional no ligada a defensa. En ese contexto, contar con capacidades nacionales de validación experimental de bajo costo para actuadores de superficies de control, aplicables indistintamente a un proyecto de UAV civil de laboratorio o a uno de interés para las Fuerzas Armadas en vez de depender exclusivamente de ensayos contratados en el extranjero, tiene un valor económico directo tanto para instituciones de investigación y formación como para el desarrollo de una industria de drones civiles emergente en el país.</w:t>
-      </w:r>
-    </w:p>
-    <w:p>
-      <w:r>
-        <w:t xml:space="preserve">La huella ambiental de la validación experimental física es habitualmente subestimada. Un túnel de viento de gran escala </w:t>
-      </w:r>
-      <w:r>
-        <w:t>(</w:t>
-      </w:r>
-      <w:r>
-        <w:t>como el usado históricamente para el desarrollo del Boeing 747</w:t>
-      </w:r>
-      <w:r>
-        <w:t>)</w:t>
-      </w:r>
-      <w:r>
-        <w:t xml:space="preserve"> requirió del orden de 10.000 horas de operación con ventiladores de hasta 7 MW de potencia. Lo que implica un consumo energético del orden de 10⁸ kWh solo para esa campaña de ensayos</w:t>
-      </w:r>
-      <w:r>
-        <w:t xml:space="preserve"> </w:t>
-      </w:r>
-      <w:bookmarkStart w:id="17" w:name="ZOTERO_BREF_BvgxpLwLSaa7"/>
-      <w:r>
-        <w:rPr>
-          <w:rFonts w:cs="Arial"/>
-        </w:rPr>
-        <w:t>[11]</w:t>
-      </w:r>
-      <w:bookmarkEnd w:id="17"/>
-      <w:r>
-        <w:t>. La sustitución progresiva de una parte de esas horas de túnel por simulación computacional (el 87 % ya mencionad</w:t>
-      </w:r>
-      <w:r>
-        <w:t>o</w:t>
-      </w:r>
-      <w:r>
-        <w:t xml:space="preserve"> en el caso de Boeing) reduce directamente esa huella energética. Este mismo razonamiento aplica, a menor escala, a cualquier campaña de validación de actuadores</w:t>
-      </w:r>
-      <w:r>
-        <w:t>.</w:t>
-      </w:r>
-      <w:r>
-        <w:t xml:space="preserve"> </w:t>
-      </w:r>
-      <w:r>
-        <w:t>C</w:t>
-      </w:r>
-      <w:r>
-        <w:t xml:space="preserve">ada hora de ensayo físico evitado mediante un banco de bajo consumo alimentado por cargas calculadas mediante simulación tiene una correlación directa en emisiones </w:t>
-      </w:r>
-      <w:r>
-        <w:t>evitadas. La</w:t>
-      </w:r>
-      <w:r>
-        <w:t xml:space="preserve"> industria aeroespacial enfrenta además una meta explícita de mitigación climática: el Plan de Acción Climática de la Aviación de Estados Unidos busca estabilizar las emisiones de CO</w:t>
-      </w:r>
-      <w:r>
-        <w:rPr>
-          <w:rFonts w:ascii="Cambria Math" w:hAnsi="Cambria Math" w:cs="Cambria Math"/>
-        </w:rPr>
-        <w:t>₂</w:t>
-      </w:r>
-      <w:r>
-        <w:t xml:space="preserve"> en el nivel de 2019 (~210 millones de toneladas m</w:t>
-      </w:r>
-      <w:r>
-        <w:rPr>
-          <w:rFonts w:cs="Arial"/>
-        </w:rPr>
-        <w:t>é</w:t>
-      </w:r>
-      <w:r>
-        <w:t xml:space="preserve">tricas), frente a una proyección sin intervención de hasta 450 millones de toneladas hacia 2050 </w:t>
-      </w:r>
-      <w:bookmarkStart w:id="18" w:name="ZOTERO_BREF_gitcQW9QFLdT"/>
-      <w:r>
-        <w:rPr>
-          <w:rFonts w:cs="Arial"/>
-        </w:rPr>
-        <w:t>[11]</w:t>
-      </w:r>
-      <w:bookmarkEnd w:id="18"/>
-      <w:r>
-        <w:t xml:space="preserve">. La simulación computacional y por extensión cualquier metodología que la aproveche más allá del diseño aerodinámico puro se identifica </w:t>
-      </w:r>
-      <w:r>
-        <w:lastRenderedPageBreak/>
-        <w:t>en esa misma literatura como una de las herramientas con potencial de contribuir a cerrar esa brecha, al reducir la necesidad de fabricar y desechar prototipos físicos sucesivos para cada iteración de diseño.</w:t>
-      </w:r>
-    </w:p>
-    <w:p>
-      <w:r>
-        <w:t xml:space="preserve">Más allá de la aplicación militar que generalmente motiva esta línea de investigación, las superficies de control actuadas son hoy un componente transversal de plataformas con impacto social directo. El mercado de drones civiles (agricultura de precisión, inspección de infraestructura, respuesta ante emergencias y monitoreo geológico) se proyecta en un rango de USD 15.000 a 33.000 millones para 2025-2026, con tasas de crecimiento anual de hasta 18 % </w:t>
-      </w:r>
-      <w:bookmarkStart w:id="19" w:name="ZOTERO_BREF_jpQIJvHhQ8Zy"/>
-      <w:r>
-        <w:rPr>
-          <w:rFonts w:cs="Arial"/>
-        </w:rPr>
-        <w:t>[8]</w:t>
-      </w:r>
-      <w:bookmarkEnd w:id="19"/>
-      <w:r>
-        <w:t>. Lo que refleja una adopción creciente de estos vehículos en tareas civiles con beneficio social directo, desde la agricultura hasta la gestión de desastres. La confiabilidad de los actuadores de superficies de control es en consecuencia relevante tanto para la seguridad de sistemas de defensa como para la de aplicaciones civiles que ya operan sobre población e infraestructura.</w:t>
-      </w:r>
-      <w:r>
-        <w:t xml:space="preserve"> </w:t>
-      </w:r>
-      <w:r>
-        <w:t>En el plano social más inmediato para este proyecto, el desarrollo de un banco de ensayos de bajo costo tiene valor como plataforma de docencia e investigación aplicada: permite formar a estudiantes en instrumentación, control y validación experimental sin requerir acceso a infraestructura de ensayo de alto costo, ampliando el acceso a este tipo de formación práctica en un contexto donde dicha infraestructura no está disponible de forma rutinaria.</w:t>
-      </w:r>
-    </w:p>
-    <w:p>
-      <w:r>
-        <w:t xml:space="preserve">La literatura revisada por este proyecto permite identificar tres familias de soluciones ya existentes. El Ensayo físico completo (túnel de viento / vuelo instrumentado) entrega la validación de mayor fidelidad, pero al costo y la escala de tiempo ya cuantificados en la sección anterior (entre cientos y miles de dólares por hora y meses de anticipación para reservar infraestructura). CFD y modelos sustitutos (surrogate </w:t>
-      </w:r>
-      <w:bookmarkStart w:id="20" w:name="ZOTERO_BREF_FTiEz1nYoYXE"/>
-      <w:r>
-        <w:t>models)</w:t>
-      </w:r>
-      <w:r>
-        <w:rPr>
-          <w:rFonts w:cs="Arial"/>
-        </w:rPr>
-        <w:t xml:space="preserve"> [</w:t>
-      </w:r>
-      <w:r>
-        <w:rPr>
-          <w:rFonts w:cs="Arial"/>
-        </w:rPr>
-        <w:t>2]</w:t>
-      </w:r>
-      <w:bookmarkEnd w:id="20"/>
-      <w:r>
-        <w:t>,</w:t>
-      </w:r>
-      <w:r>
-        <w:t xml:space="preserve"> </w:t>
-      </w:r>
-      <w:bookmarkStart w:id="21" w:name="ZOTERO_BREF_3jVlYIkPcwf2"/>
-      <w:r>
-        <w:rPr>
-          <w:rFonts w:cs="Arial"/>
-        </w:rPr>
-        <w:t>[13]</w:t>
-      </w:r>
-      <w:bookmarkEnd w:id="21"/>
-      <w:r>
-        <w:t>,</w:t>
-      </w:r>
-      <w:r>
-        <w:t xml:space="preserve"> </w:t>
-      </w:r>
-      <w:bookmarkStart w:id="22" w:name="ZOTERO_BREF_iO3MUyjoHw8g"/>
-      <w:r>
-        <w:rPr>
-          <w:rFonts w:cs="Arial"/>
-        </w:rPr>
-        <w:t>[14]</w:t>
-      </w:r>
-      <w:bookmarkEnd w:id="22"/>
-      <w:r>
-        <w:t xml:space="preserve"> y</w:t>
-      </w:r>
-      <w:r>
-        <w:t xml:space="preserve"> </w:t>
-      </w:r>
-      <w:bookmarkStart w:id="23" w:name="ZOTERO_BREF_2j90Q4F2zscy"/>
-      <w:r>
-        <w:rPr>
-          <w:rFonts w:cs="Arial"/>
-        </w:rPr>
-        <w:t>[3]</w:t>
-      </w:r>
-      <w:bookmarkEnd w:id="23"/>
-      <w:r>
-        <w:t xml:space="preserve"> demuestran que es posible generar tablas de carga aerodinámica multidimensionales con un número acotado de simulaciones y errores de interpolación bajos, resolviendo el problema de generar la carga, pero no el de aplicarla físicamente sobre un actuador candidato. Los simuladores de carga y bancos de ensayo dinámicos</w:t>
-      </w:r>
-      <w:r>
-        <w:t xml:space="preserve"> </w:t>
-      </w:r>
-      <w:bookmarkStart w:id="24" w:name="ZOTERO_BREF_JCs7Q32AoomB"/>
-      <w:r>
-        <w:rPr>
-          <w:rFonts w:cs="Arial"/>
-        </w:rPr>
-        <w:t>[15]</w:t>
-      </w:r>
-      <w:bookmarkEnd w:id="24"/>
-      <w:r>
-        <w:rPr>
-          <w:rFonts w:cs="Arial"/>
-        </w:rPr>
-        <w:t xml:space="preserve">, </w:t>
-      </w:r>
-      <w:bookmarkStart w:id="25" w:name="ZOTERO_BREF_S3YT3GZJXvK2"/>
-      <w:r>
-        <w:rPr>
-          <w:rFonts w:cs="Arial"/>
-        </w:rPr>
-        <w:t>[16]</w:t>
-      </w:r>
-      <w:bookmarkEnd w:id="25"/>
-      <w:r>
-        <w:rPr>
-          <w:rFonts w:cs="Arial"/>
-        </w:rPr>
-        <w:t xml:space="preserve">, </w:t>
-      </w:r>
-      <w:bookmarkStart w:id="26" w:name="ZOTERO_BREF_N3ceS6RPYzps"/>
-      <w:r>
-        <w:rPr>
-          <w:rFonts w:cs="Arial"/>
-        </w:rPr>
-        <w:t>[17]</w:t>
-      </w:r>
-      <w:bookmarkEnd w:id="26"/>
-      <w:r>
-        <w:rPr>
-          <w:rFonts w:cs="Arial"/>
-        </w:rPr>
-        <w:t xml:space="preserve">, </w:t>
-      </w:r>
-      <w:bookmarkStart w:id="27" w:name="ZOTERO_BREF_8GXUYAgyyPyZ"/>
-      <w:r>
-        <w:rPr>
-          <w:rFonts w:cs="Arial"/>
-        </w:rPr>
-        <w:t>[18]</w:t>
-      </w:r>
-      <w:bookmarkEnd w:id="27"/>
-      <w:r>
-        <w:t xml:space="preserve"> resuelven el problema de aplicar una carga controlada sobre un actuador, pero casi en su totalidad a escala hidráulica y de cientos a miles de Nm, orientada a la industria aeroespacial de gran escala. El antecedente de menor escala y objetivo más cercano (</w:t>
-      </w:r>
-      <w:bookmarkStart w:id="28" w:name="ZOTERO_BREF_F4YsipiTrDIS"/>
-      <w:r>
-        <w:rPr>
-          <w:rFonts w:cs="Arial"/>
-        </w:rPr>
-        <w:t>[4]</w:t>
-      </w:r>
-      <w:bookmarkEnd w:id="28"/>
-      <w:r>
-        <w:t>) sigue siendo un caso aislado y no una metodología de bajo costo ya estandarizada.</w:t>
-      </w:r>
-    </w:p>
-    <w:p>
-      <w:r>
-        <w:t>La brecha específica que se debe abordar es la combinación de: escala pequeña y bajo costo (componentes COTS, torque muy por debajo de la literatura de simuladores de carga de gran escala</w:t>
-      </w:r>
-      <w:r>
-        <w:t>) y</w:t>
-      </w:r>
-      <w:r>
-        <w:t xml:space="preserve"> recálculo del torque objetivo en tiempo real a partir de la posición y velocidad angular reales de la superficie de control. Ninguna de </w:t>
-      </w:r>
-      <w:r>
-        <w:t>las referencias</w:t>
-      </w:r>
-      <w:r>
-        <w:t xml:space="preserve"> revisadas replica esta combinación como conjunto, lo que constituye tanto la brecha diagnosticada como el espacio de contribución de esta memoria.</w:t>
-      </w:r>
-    </w:p>
-    <w:p>
-      <w:r>
-        <w:t>La evidencia reunida en las dimensiones anteriores converge en una misma conclusión.</w:t>
-      </w:r>
-      <w:r>
-        <w:t xml:space="preserve"> D</w:t>
-      </w:r>
-      <w:r>
-        <w:t>esarrollar un banco de ensayos capaz de traducir cargas obtenidas</w:t>
-      </w:r>
-      <w:r>
-        <w:t xml:space="preserve"> de simulación computacional</w:t>
-      </w:r>
-      <w:r>
-        <w:t xml:space="preserve"> en condiciones físicas reproducibles sobre un actuador de superficies de control, a una escala y costo accesibles para un laboratorio universitario, no solo llena un vacío metodológico documentado en la literatura, sino que responde a una necesidad </w:t>
-      </w:r>
-      <w:r>
-        <w:lastRenderedPageBreak/>
-        <w:t>cuantificable en los cuatro ámbitos examinados. Ese es el problema concreto que esta memoria de título busca abordar.</w:t>
-      </w:r>
-    </w:p>
-    <w:p/>
-    <w:p>
-      <w:pPr>
-        <w:pStyle w:val="Ttulo2"/>
-      </w:pPr>
-      <w:bookmarkStart w:id="29" w:name="_Toc239894270"/>
-      <w:r>
-        <w:t>Hipótesis</w:t>
-      </w:r>
-      <w:bookmarkEnd w:id="29"/>
-    </w:p>
-    <w:p>
-      <w:r>
-        <w:rPr>
-          <w:highlight w:val="yellow"/>
-        </w:rPr>
-        <w:t>La hipótesis de un estudio es una declaración clara y comprobable que predice un resultado basado en la comprensión inicial del problema de investigación. Debe ser formulada después de una revisión exhaustiva de la literatura y la identificación de brechas dentro de ella. Una buena hipótesis se relaciona directamente con la pregunta de investigación y está enmarcada de manera que permite su comprobación mediante investigación empírica. Típicamente adopta una forma declarativa, postulando una relación entre variables que puede ser respaldada o refutada por los datos recopilados (establecimiento de hipótesis nula). Se debe asegurar claridad y especificidad en la hipótesis para facilitar un diseño de investigación y análisis enfocado, convirtiéndola en un elemento importante del estudio.</w:t>
-      </w:r>
-    </w:p>
-    <w:p>
-      <w:r>
-        <w:t>La implementación de un banco de ensayos basado en cargas fluidodinámicas equivalentes permitirá evaluar experimentalmente actuadores de superficies de control, proporcionando parámetros de desempeño que pueden ser utilizados como apoyo al proceso de dimensionamiento y selección de estos componentes.</w:t>
-      </w:r>
-    </w:p>
-    <w:p>
-      <w:pPr>
-        <w:pStyle w:val="Ttulo2"/>
-      </w:pPr>
-      <w:bookmarkStart w:id="30" w:name="_Toc239894271"/>
-      <w:r>
-        <w:t>Objetivos</w:t>
-      </w:r>
-      <w:bookmarkEnd w:id="30"/>
-    </w:p>
-    <w:p>
-      <w:pPr>
-        <w:rPr>
-          <w:color w:val="000000" w:themeColor="text1"/>
-          <w:highlight w:val="yellow"/>
-        </w:rPr>
-      </w:pPr>
-      <w:r>
-        <w:rPr>
-          <w:color w:val="000000" w:themeColor="text1"/>
-          <w:highlight w:val="yellow"/>
-        </w:rPr>
-        <w:t xml:space="preserve">Los objetivos de </w:t>
-      </w:r>
-      <w:r>
-        <w:rPr>
-          <w:color w:val="000000" w:themeColor="text1"/>
-          <w:highlight w:val="yellow"/>
-        </w:rPr>
-        <w:t>un estudio</w:t>
-      </w:r>
-      <w:r>
-        <w:rPr>
-          <w:color w:val="000000" w:themeColor="text1"/>
-          <w:highlight w:val="yellow"/>
-        </w:rPr>
-        <w:t xml:space="preserve"> describen lo que la investigación pretende lograr. Se divide en objetivo general, que proporciona una visión global del objetivo de la investigación, y objetivos específicos, que desglosan el objetivo general en resultados más pequeños y medibles. Escribir objetivos claros y concisos es esencial para guiar el proceso de investigación y clarificar el enfoque del estudio tanto para el investigador como para los lectores.</w:t>
-      </w:r>
-    </w:p>
-    <w:p>
-      <w:pPr>
-        <w:rPr>
-          <w:color w:val="000000" w:themeColor="text1"/>
-          <w:highlight w:val="yellow"/>
-        </w:rPr>
-      </w:pPr>
-      <w:r>
-        <w:rPr>
-          <w:color w:val="000000" w:themeColor="text1"/>
-          <w:highlight w:val="yellow"/>
-        </w:rPr>
-        <w:t>Se comienza con el objetivo general expresando la meta global de la investigación. Esto debe ser una declaración concisa que refleje el objetivo general del estudio, derivado directamente de la declaración del problema o de la pregunta de investigación. Dirige el resultado esperado a un alto nivel, como entender un fenómeno, determinar la efectividad de una estrategia o explorar una relación entre variables.</w:t>
-      </w:r>
-    </w:p>
-    <w:p>
-      <w:pPr>
-        <w:rPr>
-          <w:color w:val="000000" w:themeColor="text1"/>
-        </w:rPr>
-      </w:pPr>
-      <w:r>
-        <w:rPr>
-          <w:color w:val="000000" w:themeColor="text1"/>
-          <w:highlight w:val="yellow"/>
-        </w:rPr>
-        <w:t>Los objetivos específicos deben desglosar el objetivo general en componentes más pequeños y detallados. Cada objetivo específico se centra en un aspecto diferente de la investigación, contribuyendo colectivamente a lograr el objetivo general. Deben ser declaraciones claras, precisas, realizables y medibles que guíen la metodología y el análisis. Que cada objetivo específico sea medible, significa que hay un criterio claro de éxito. Esto hace que los resultados de la investigación sean verificables y permite un enfoque sistemático para la recolección y análisis de datos.</w:t>
-      </w:r>
-    </w:p>
-    <w:p>
-      <w:pPr>
-        <w:rPr>
-          <w:color w:val="000000" w:themeColor="text1"/>
-        </w:rPr>
-      </w:pPr>
-      <w:r>
-        <w:rPr>
-          <w:color w:val="000000" w:themeColor="text1"/>
-          <w:highlight w:val="yellow"/>
-        </w:rPr>
-        <w:t>Uno debe asegurarse que sus objetivos específicos se alineen con los componentes de la investigación, como la revisión de literatura, metodología, análisis de datos y discusión. Cada objetivo debe conducir a una sección de su investigación, creando una estructura coherente que aborde sistemáticamente el problema de investigación o pregunta a resolver.</w:t>
-      </w:r>
-    </w:p>
-    <w:p>
-      <w:pPr>
-        <w:rPr>
-          <w:color w:val="000000" w:themeColor="text1"/>
-        </w:rPr>
-      </w:pPr>
-      <w:r>
-        <w:rPr>
-          <w:color w:val="000000" w:themeColor="text1"/>
-        </w:rPr>
-        <w:lastRenderedPageBreak/>
-        <w:t>OG: Diseñar e implementar un banco de ensayos para la verificación y caracterización de actuadores COTS</w:t>
-      </w:r>
-      <w:r>
-        <w:rPr>
-          <w:color w:val="000000" w:themeColor="text1"/>
-        </w:rPr>
-        <w:t xml:space="preserve"> </w:t>
-      </w:r>
-      <w:r>
-        <w:rPr>
-          <w:color w:val="000000" w:themeColor="text1"/>
-        </w:rPr>
-        <w:t>de superficies de control utilizando cargas fluidodinámicas obtenidas mediante simulación Computacional.</w:t>
-      </w:r>
-    </w:p>
-    <w:p>
-      <w:pPr>
-        <w:pStyle w:val="Ttulo3"/>
-      </w:pPr>
-      <w:bookmarkStart w:id="31" w:name="_Toc239894272"/>
-      <w:r>
-        <w:t>Objetivos específicos</w:t>
-      </w:r>
-      <w:bookmarkEnd w:id="31"/>
-    </w:p>
-    <w:p>
-      <w:r>
-        <w:t xml:space="preserve">OE1: </w:t>
-      </w:r>
-      <w:r>
-        <w:rPr>
-          <w:b/>
-          <w:bCs/>
-        </w:rPr>
-        <w:t>Concebir</w:t>
-      </w:r>
-      <w:r>
-        <w:t xml:space="preserve"> un diseño preliminar en base del estado del arte de actuadores, bancos de ensayo y </w:t>
-      </w:r>
-      <w:r>
-        <w:t>metodologías</w:t>
-      </w:r>
-      <w:r>
-        <w:t xml:space="preserve"> de simulación computacional relevantes para el proyecto.</w:t>
-      </w:r>
-    </w:p>
-    <w:p>
-      <w:r>
-        <w:t xml:space="preserve">OE2: </w:t>
-      </w:r>
-      <w:r>
-        <w:rPr>
-          <w:b/>
-          <w:bCs/>
-        </w:rPr>
-        <w:t>Desarrollar</w:t>
-      </w:r>
-      <w:r>
-        <w:t xml:space="preserve"> una metodología para obtener y procesar cargas fluidodinámicas mediante simulaciones computacionales.</w:t>
-      </w:r>
-    </w:p>
-    <w:p>
-      <w:r>
-        <w:t xml:space="preserve">OE3: </w:t>
-      </w:r>
-      <w:r>
-        <w:rPr>
-          <w:b/>
-          <w:bCs/>
-        </w:rPr>
-        <w:t>Diseñar</w:t>
-      </w:r>
-      <w:r>
-        <w:t xml:space="preserve"> la arquitectura mecánica, electrónica, de software y de control de la plataforma experimental.</w:t>
-      </w:r>
-    </w:p>
-    <w:p>
-      <w:r>
-        <w:t xml:space="preserve">OE4: </w:t>
-      </w:r>
-      <w:r>
-        <w:rPr>
-          <w:b/>
-          <w:bCs/>
-        </w:rPr>
-        <w:t>Implementar</w:t>
-      </w:r>
-      <w:r>
-        <w:t xml:space="preserve"> el banco de ensayos y </w:t>
-      </w:r>
-      <w:r>
-        <w:rPr>
-          <w:b/>
-          <w:bCs/>
-        </w:rPr>
-        <w:t>Verificar</w:t>
-      </w:r>
-      <w:r>
-        <w:t xml:space="preserve"> la plataforma experimental mediante ensayos de actuadores de superficies de control.</w:t>
-      </w:r>
-    </w:p>
-    <w:p>
-      <w:pPr>
-        <w:pStyle w:val="Ttulo2"/>
-      </w:pPr>
-      <w:bookmarkStart w:id="32" w:name="_Toc239894273"/>
-      <w:r>
-        <w:t>Descripción del trabajo</w:t>
-      </w:r>
-      <w:bookmarkEnd w:id="32"/>
-    </w:p>
-    <w:p>
-      <w:pPr>
-        <w:rPr>
-          <w:color w:val="000000" w:themeColor="text1"/>
-          <w:highlight w:val="yellow"/>
-        </w:rPr>
-      </w:pPr>
-      <w:r>
-        <w:rPr>
-          <w:color w:val="000000" w:themeColor="text1"/>
-          <w:highlight w:val="yellow"/>
-        </w:rPr>
-        <w:t>Escribir la descripción del trabajo en relación con los objetivos implica vincular claramente las actividades de investigación y contenido con los objetivos específicos delineados. Esta sección demuestra cómo cada parte del estudio contribuye a alcanzar los objetivos específicos, asegurando coherencia y enfoque a lo largo del trabajo.</w:t>
-      </w:r>
-    </w:p>
-    <w:p>
-      <w:pPr>
-        <w:rPr>
-          <w:color w:val="000000" w:themeColor="text1"/>
-          <w:highlight w:val="yellow"/>
-        </w:rPr>
-      </w:pPr>
-      <w:r>
-        <w:rPr>
-          <w:color w:val="000000" w:themeColor="text1"/>
-          <w:highlight w:val="yellow"/>
-        </w:rPr>
-        <w:t>Se debe comenzar detallando las actividades de investigación, métodos y enfoques adoptados. Cada actividad se conecta explícitamente con uno o más de los objetivos específicos. Esto muestra cómo cada elemento del trabajo está diseñado intencionalmente para contribuir a alcanzar las metas.</w:t>
-      </w:r>
-    </w:p>
-    <w:p>
-      <w:pPr>
-        <w:rPr>
-          <w:color w:val="000000" w:themeColor="text1"/>
-        </w:rPr>
-      </w:pPr>
-      <w:r>
-        <w:rPr>
-          <w:color w:val="000000" w:themeColor="text1"/>
-          <w:highlight w:val="yellow"/>
-        </w:rPr>
-        <w:t>Es importante organizar esta descripción en una secuencia lógica que refleje el flujo del proceso de investigación. Se comienza con pasos preliminares como la revisión de literatura, seguido por la metodología, recolección de datos, análisis y, finalmente, discusión y conclusión. Para cada paso, se explica cómo se abordan los objetivos específicos, contribuyendo al objetivo general.</w:t>
-      </w:r>
-    </w:p>
-    <w:p>
-      <w:pPr>
-        <w:pStyle w:val="Ttulo1"/>
-      </w:pPr>
-      <w:bookmarkStart w:id="33" w:name="_Toc239894274"/>
-      <w:r>
-        <w:t>Metodología</w:t>
-      </w:r>
-      <w:bookmarkEnd w:id="33"/>
-    </w:p>
-    <w:p>
-      <w:pPr>
-        <w:rPr>
-          <w:color w:val="000000" w:themeColor="text1"/>
-          <w:highlight w:val="yellow"/>
-        </w:rPr>
-      </w:pPr>
-      <w:r>
-        <w:rPr>
-          <w:color w:val="000000" w:themeColor="text1"/>
-          <w:highlight w:val="yellow"/>
-        </w:rPr>
-        <w:t>La sección de metodología describe el diseño de investigación y los procedimientos utilizados, permitiendo a los lectores evaluar la validez y confiabilidad del estudio. Sirve como un plano detallado de cómo se llevó a cabo la investigación, incluyendo la selección de los casos de estudio, métodos de recolección de datos y técnicas de análisis. Estos métodos pueden incluir experimentos, simulaciones o levantamiento de datos de otras fuentes externas.</w:t>
-      </w:r>
-    </w:p>
-    <w:p>
-      <w:pPr>
-        <w:rPr>
-          <w:color w:val="000000" w:themeColor="text1"/>
-        </w:rPr>
-      </w:pPr>
-      <w:r>
-        <w:rPr>
-          <w:color w:val="000000" w:themeColor="text1"/>
-          <w:highlight w:val="yellow"/>
-        </w:rPr>
-        <w:t>Se comienza describiendo el diseño general de la investigación, indicando cómo este diseño se enfoca a cumplir los objetivos y detallando sus alcances. Junto a esto, se presenta el o los casos de estudio, indicando sus características y limitaciones.</w:t>
-      </w:r>
-    </w:p>
-    <w:p>
-      <w:pPr>
-        <w:rPr>
-          <w:color w:val="000000" w:themeColor="text1"/>
-          <w:highlight w:val="yellow"/>
-        </w:rPr>
-      </w:pPr>
-      <w:r>
-        <w:rPr>
-          <w:color w:val="000000" w:themeColor="text1"/>
-          <w:highlight w:val="yellow"/>
-        </w:rPr>
-        <w:lastRenderedPageBreak/>
-        <w:t xml:space="preserve">A continuación, se explican claramente los métodos utilizados para generar los datos, como experimentos, simulaciones o investigación sobre datos históricos. Se debe ser específico sobre las herramientas, instrumentos o tecnologías utilizadas y justificar por qué estos métodos fueron elegidos sobre otros.  Luego, se describen los procedimientos utilizados para analizar los datos recolectados. Especialmente para estudios experimentales, esto podría incluir análisis estadístico como pruebas de hipótesis, estimación de intervalos o análisis de varianza. </w:t>
-      </w:r>
-    </w:p>
-    <w:p>
-      <w:pPr>
-        <w:rPr>
-          <w:color w:val="000000" w:themeColor="text1"/>
-        </w:rPr>
-      </w:pPr>
-      <w:r>
-        <w:rPr>
-          <w:color w:val="000000" w:themeColor="text1"/>
-          <w:highlight w:val="yellow"/>
-        </w:rPr>
-        <w:t>Uno de los principales objetivos de la sección de metodología es asegurar la replicabilidad de los resultados. Esto quiere decir, que cualquier otra persona podría seguir paso a paso lo indicado en esta sección para replicar los resultados que se mostrarán luego. Por lo tanto, se debe ser lo suficientemente específico en explicar el diseño y procedimiento, sin dejar aspectos clave de lado.</w:t>
-      </w:r>
-    </w:p>
-    <w:p>
-      <w:pPr>
-        <w:spacing w:after="160" w:line="259" w:lineRule="auto"/>
-        <w:jc w:val="left"/>
-        <w:rPr>
-          <w:color w:val="000000" w:themeColor="text1"/>
-        </w:rPr>
-      </w:pPr>
-      <w:r>
-        <w:rPr>
-          <w:color w:val="000000" w:themeColor="text1"/>
-        </w:rPr>
-        <w:br w:type="page"/>
-      </w:r>
-    </w:p>
-    <w:bookmarkStart w:id="34" w:name="_Toc239894275" w:displacedByCustomXml="next"/>
+    <w:bookmarkStart w:id="32" w:name="_Toc239978850" w:displacedByCustomXml="next"/>
     <w:sdt>
       <w:sdtPr>
         <w:rPr>
@@ -2737,7 +2351,6 @@
           <w:color w:val="auto"/>
           <w:sz w:val="22"/>
           <w:szCs w:val="22"/>
-          <w:lang w:val="es-MX"/>
         </w:rPr>
         <w:id w:val="532539752"/>
         <w:docPartObj>
@@ -2752,40 +2365,33 @@
           <w:color w:val="000000" w:themeColor="text1"/>
           <w:sz w:val="32"/>
           <w:szCs w:val="40"/>
-          <w:lang w:val="es-CL"/>
         </w:rPr>
       </w:sdtEndPr>
       <w:sdtContent>
         <w:p>
           <w:pPr>
             <w:pStyle w:val="Anexo"/>
-            <w:rPr>
-              <w:lang w:val="en-US"/>
-            </w:rPr>
           </w:pPr>
           <w:r>
-            <w:rPr>
-              <w:lang w:val="en-US"/>
-            </w:rPr>
             <w:t>Referencias</w:t>
           </w:r>
         </w:p>
       </w:sdtContent>
     </w:sdt>
-    <w:bookmarkEnd w:id="34" w:displacedByCustomXml="prev"/>
+    <w:bookmarkEnd w:id="32" w:displacedByCustomXml="prev"/>
     <w:p>
       <w:pPr>
         <w:pStyle w:val="Bibliografa"/>
-        <w:rPr>
-          <w:lang w:val="en-US"/>
-        </w:rPr>
       </w:pPr>
     </w:p>
     <w:p>
       <w:pPr>
         <w:pStyle w:val="Bibliografa"/>
-      </w:pPr>
-      <w:bookmarkStart w:id="35" w:name="ZOTERO_BREF_eIRCVLm5ypBy"/>
+        <w:rPr>
+          <w:lang w:val="en-US"/>
+        </w:rPr>
+      </w:pPr>
+      <w:bookmarkStart w:id="33" w:name="ZOTERO_BREF_eIRCVLm5ypBy"/>
       <w:r>
         <w:rPr>
           <w:lang w:val="en-US"/>
@@ -2809,20 +2415,21 @@
         <w:rPr>
           <w:lang w:val="en-US"/>
         </w:rPr>
-        <w:t xml:space="preserve"> Thesis, Utah State University, 2016. </w:t>
-      </w:r>
-      <w:r>
-        <w:t xml:space="preserve">[En línea]. Disponible en: </w:t>
+        <w:t xml:space="preserve"> Thesis, Utah State University, 2016. [En línea]. Disponible en: </w:t>
       </w:r>
       <w:hyperlink r:id="rId13" w:history="1">
         <w:r>
           <w:rPr>
             <w:rStyle w:val="Hipervnculo"/>
+            <w:lang w:val="en-US"/>
           </w:rPr>
           <w:t>https://ui.adsabs.harvard.edu/abs/2016MsT.........46S/abstract</w:t>
         </w:r>
       </w:hyperlink>
       <w:r>
+        <w:rPr>
+          <w:lang w:val="en-US"/>
+        </w:rPr>
         <w:t xml:space="preserve"> </w:t>
       </w:r>
     </w:p>
@@ -3060,6 +2667,9 @@
     <w:p>
       <w:pPr>
         <w:pStyle w:val="Bibliografa"/>
+        <w:rPr>
+          <w:lang w:val="en-US"/>
+        </w:rPr>
       </w:pPr>
       <w:r>
         <w:rPr>
@@ -3072,26 +2682,30 @@
           <w:lang w:val="en-US"/>
         </w:rPr>
         <w:tab/>
-        <w:t xml:space="preserve">Global Market Insights, “Precision Guided Munition Market Size &amp; Share Report, 2034”. </w:t>
-      </w:r>
-      <w:r>
-        <w:t xml:space="preserve">2025. [En línea]. Disponible en: </w:t>
+        <w:t xml:space="preserve">Global Market Insights, “Precision Guided Munition Market Size &amp; Share Report, 2034”. 2025. [En línea]. Disponible en: </w:t>
       </w:r>
       <w:hyperlink r:id="rId16" w:history="1">
         <w:r>
           <w:rPr>
             <w:rStyle w:val="Hipervnculo"/>
+            <w:lang w:val="en-US"/>
           </w:rPr>
           <w:t>https://www.gminsights.com/industry-analysis/precision-guided-munition-market</w:t>
         </w:r>
       </w:hyperlink>
       <w:r>
+        <w:rPr>
+          <w:lang w:val="en-US"/>
+        </w:rPr>
         <w:t xml:space="preserve"> </w:t>
       </w:r>
     </w:p>
     <w:p>
       <w:pPr>
         <w:pStyle w:val="Bibliografa"/>
+        <w:rPr>
+          <w:lang w:val="en-US"/>
+        </w:rPr>
       </w:pPr>
       <w:r>
         <w:rPr>
@@ -3104,26 +2718,30 @@
           <w:lang w:val="en-US"/>
         </w:rPr>
         <w:tab/>
-        <w:t xml:space="preserve">Research and Markets, “Civilian Drones Market — Global Forecast 2026–2032”. </w:t>
-      </w:r>
-      <w:r>
-        <w:t xml:space="preserve">2026. [En línea]. Disponible en: </w:t>
+        <w:t xml:space="preserve">Research and Markets, “Civilian Drones Market — Global Forecast 2026–2032”. 2026. [En línea]. Disponible en: </w:t>
       </w:r>
       <w:hyperlink r:id="rId17" w:history="1">
         <w:r>
           <w:rPr>
             <w:rStyle w:val="Hipervnculo"/>
+            <w:lang w:val="en-US"/>
           </w:rPr>
           <w:t>https://www.researchandmarkets.com/report/civilian-drone</w:t>
         </w:r>
       </w:hyperlink>
       <w:r>
+        <w:rPr>
+          <w:lang w:val="en-US"/>
+        </w:rPr>
         <w:t xml:space="preserve"> </w:t>
       </w:r>
     </w:p>
     <w:p>
       <w:pPr>
         <w:pStyle w:val="Bibliografa"/>
+        <w:rPr>
+          <w:lang w:val="en-US"/>
+        </w:rPr>
       </w:pPr>
       <w:r>
         <w:rPr>
@@ -3136,26 +2754,30 @@
           <w:lang w:val="en-US"/>
         </w:rPr>
         <w:tab/>
-        <w:t xml:space="preserve">MarketsandMarkets, “Unmanned Aerial Vehicle (UAV) Market Report 2025–2030”. </w:t>
-      </w:r>
-      <w:r>
-        <w:t xml:space="preserve">2025. [En línea]. Disponible en: </w:t>
+        <w:t xml:space="preserve">MarketsandMarkets, “Unmanned Aerial Vehicle (UAV) Market Report 2025–2030”. 2025. [En línea]. Disponible en: </w:t>
       </w:r>
       <w:hyperlink r:id="rId18" w:history="1">
         <w:r>
           <w:rPr>
             <w:rStyle w:val="Hipervnculo"/>
+            <w:lang w:val="en-US"/>
           </w:rPr>
           <w:t>https://www.marketsandmarkets.com/Market-Reports/unmanned-aerial-vehicles-uav-market-662.html</w:t>
         </w:r>
       </w:hyperlink>
       <w:r>
+        <w:rPr>
+          <w:lang w:val="en-US"/>
+        </w:rPr>
         <w:t xml:space="preserve"> </w:t>
       </w:r>
     </w:p>
     <w:p>
       <w:pPr>
         <w:pStyle w:val="Bibliografa"/>
+        <w:rPr>
+          <w:lang w:val="en-US"/>
+        </w:rPr>
       </w:pPr>
       <w:r>
         <w:rPr>
@@ -3168,26 +2790,30 @@
           <w:lang w:val="en-US"/>
         </w:rPr>
         <w:tab/>
-        <w:t xml:space="preserve">Aerospace America / AIAA, “Symbiosis: Why CFD and Wind Tunnels Need Each Other”. </w:t>
-      </w:r>
-      <w:r>
-        <w:t xml:space="preserve">2021. [En línea]. Disponible en: </w:t>
+        <w:t xml:space="preserve">Aerospace America / AIAA, “Symbiosis: Why CFD and Wind Tunnels Need Each Other”. 2021. [En línea]. Disponible en: </w:t>
       </w:r>
       <w:hyperlink r:id="rId19" w:history="1">
         <w:r>
           <w:rPr>
             <w:rStyle w:val="Hipervnculo"/>
+            <w:lang w:val="en-US"/>
           </w:rPr>
           <w:t>https://aerospaceamerica.aiaa.org/features/symbiosis-why-cfd-and-wind-tunnels-need-each-other/</w:t>
         </w:r>
       </w:hyperlink>
       <w:r>
+        <w:rPr>
+          <w:lang w:val="en-US"/>
+        </w:rPr>
         <w:t xml:space="preserve"> </w:t>
       </w:r>
     </w:p>
     <w:p>
       <w:pPr>
         <w:pStyle w:val="Bibliografa"/>
+        <w:rPr>
+          <w:lang w:val="en-US"/>
+        </w:rPr>
       </w:pPr>
       <w:r>
         <w:rPr>
@@ -3208,40 +2834,52 @@
           <w:iCs/>
           <w:lang w:val="en-US"/>
         </w:rPr>
-        <w:t xml:space="preserve">ArXiv Prepr. </w:t>
-      </w:r>
-      <w:r>
-        <w:rPr>
-          <w:i/>
-          <w:iCs/>
-        </w:rPr>
-        <w:t>ArXiv240205985</w:t>
-      </w:r>
-      <w:r>
+        <w:t>ArXiv Prepr. ArXiv240205985</w:t>
+      </w:r>
+      <w:r>
+        <w:rPr>
+          <w:lang w:val="en-US"/>
+        </w:rPr>
         <w:t xml:space="preserve">, 2024, [En línea]. Disponible en: </w:t>
       </w:r>
       <w:hyperlink r:id="rId20" w:history="1">
         <w:r>
           <w:rPr>
             <w:rStyle w:val="Hipervnculo"/>
+            <w:lang w:val="en-US"/>
           </w:rPr>
           <w:t>https://arxiv.org/pdf/2402.05985</w:t>
         </w:r>
       </w:hyperlink>
       <w:r>
+        <w:rPr>
+          <w:lang w:val="en-US"/>
+        </w:rPr>
         <w:t xml:space="preserve"> </w:t>
       </w:r>
     </w:p>
     <w:p>
       <w:pPr>
         <w:pStyle w:val="Bibliografa"/>
-      </w:pPr>
-      <w:r>
+        <w:rPr>
+          <w:lang w:val="en-US"/>
+        </w:rPr>
+      </w:pPr>
+      <w:r>
+        <w:rPr>
+          <w:lang w:val="en-US"/>
+        </w:rPr>
         <w:t>[12]</w:t>
       </w:r>
       <w:r>
+        <w:rPr>
+          <w:lang w:val="en-US"/>
+        </w:rPr>
         <w:tab/>
-        <w:t xml:space="preserve">Stockholm International Peace Research Institute (SIPRI), “Informe SIPRI 2025: Chile sigue entre los países con más gasto militar en América Latina”. 2025. [En línea]. Disponible en: </w:t>
+        <w:t xml:space="preserve">Stockholm International Peace Research Institute (SIPRI), “Informe SIPRI 2025: Chile </w:t>
+      </w:r>
+      <w:r>
+        <w:t xml:space="preserve">sigue entre los países con más gasto militar en América Latina”. 2025. [En línea]. Disponible en: </w:t>
       </w:r>
       <w:hyperlink r:id="rId21" w:history="1">
         <w:r>
@@ -3252,6 +2890,9 @@
         </w:r>
       </w:hyperlink>
       <w:r>
+        <w:rPr>
+          <w:lang w:val="en-US"/>
+        </w:rPr>
         <w:t xml:space="preserve"> </w:t>
       </w:r>
     </w:p>
@@ -3348,7 +2989,16 @@
         <w:rPr>
           <w:lang w:val="en-US"/>
         </w:rPr>
-        <w:t xml:space="preserve"> 2, pp. 498–507, 2008, doi: 10.2514/1.32308.</w:t>
+        <w:t xml:space="preserve"> 2, pp. 498–507, 2008, doi:</w:t>
+      </w:r>
+      <w:r>
+        <w:t xml:space="preserve"> </w:t>
+      </w:r>
+      <w:r>
+        <w:rPr>
+          <w:lang w:val="en-US"/>
+        </w:rPr>
+        <w:t>10.2514/1.32308.</w:t>
       </w:r>
     </w:p>
     <w:p>
@@ -3499,6 +3149,9 @@
     <w:p>
       <w:pPr>
         <w:pStyle w:val="Bibliografa"/>
+        <w:rPr>
+          <w:lang w:val="en-US"/>
+        </w:rPr>
       </w:pPr>
       <w:r>
         <w:rPr>
@@ -3519,29 +3172,29 @@
           <w:iCs/>
           <w:lang w:val="en-US"/>
         </w:rPr>
-        <w:t xml:space="preserve">IEEE Trans. </w:t>
-      </w:r>
-      <w:r>
-        <w:rPr>
-          <w:i/>
-          <w:iCs/>
-        </w:rPr>
-        <w:t>Aerosp. Electron. Syst.</w:t>
-      </w:r>
-      <w:r>
+        <w:t>IEEE Trans. Aerosp. Electron. Syst.</w:t>
+      </w:r>
+      <w:r>
+        <w:rPr>
+          <w:lang w:val="en-US"/>
+        </w:rPr>
         <w:t>, vol. 37, n</w:t>
       </w:r>
       <w:r>
         <w:rPr>
           <w:vertAlign w:val="superscript"/>
+          <w:lang w:val="en-US"/>
         </w:rPr>
         <w:t>o</w:t>
       </w:r>
       <w:r>
+        <w:rPr>
+          <w:lang w:val="en-US"/>
+        </w:rPr>
         <w:t xml:space="preserve"> 4, pp. 1384–1392, 2001, doi: 10.1109/7.976972.</w:t>
       </w:r>
     </w:p>
-    <w:bookmarkEnd w:id="35"/>
+    <w:bookmarkEnd w:id="33"/>
     <w:p>
       <w:pPr>
         <w:spacing w:after="160" w:line="259" w:lineRule="auto"/>
@@ -3612,6 +3265,11 @@
         <w:docPartUnique/>
       </w:docPartObj>
     </w:sdtPr>
+    <w:sdtEndPr>
+      <w:rPr>
+        <w:rStyle w:val="Nmerodepgina"/>
+      </w:rPr>
+    </w:sdtEndPr>
     <w:sdtContent>
       <w:p>
         <w:pPr>
@@ -3653,6 +3311,11 @@
         <w:docPartUnique/>
       </w:docPartObj>
     </w:sdtPr>
+    <w:sdtEndPr>
+      <w:rPr>
+        <w:rStyle w:val="Nmerodepgina"/>
+      </w:rPr>
+    </w:sdtEndPr>
     <w:sdtContent>
       <w:p>
         <w:pPr>
@@ -3694,6 +3357,11 @@
         <w:docPartUnique/>
       </w:docPartObj>
     </w:sdtPr>
+    <w:sdtEndPr>
+      <w:rPr>
+        <w:rStyle w:val="Nmerodepgina"/>
+      </w:rPr>
+    </w:sdtEndPr>
     <w:sdtContent>
       <w:p>
         <w:pPr>
@@ -3735,6 +3403,11 @@
         <w:docPartUnique/>
       </w:docPartObj>
     </w:sdtPr>
+    <w:sdtEndPr>
+      <w:rPr>
+        <w:rStyle w:val="Nmerodepgina"/>
+      </w:rPr>
+    </w:sdtEndPr>
     <w:sdtContent>
       <w:p>
         <w:pPr>
@@ -3786,6 +3459,11 @@
         <w:docPartUnique/>
       </w:docPartObj>
     </w:sdtPr>
+    <w:sdtEndPr>
+      <w:rPr>
+        <w:rStyle w:val="Nmerodepgina"/>
+      </w:rPr>
+    </w:sdtEndPr>
     <w:sdtContent>
       <w:p>
         <w:pPr>
@@ -3816,7 +3494,6 @@
         <w:r>
           <w:rPr>
             <w:rStyle w:val="Nmerodepgina"/>
-            <w:noProof/>
           </w:rPr>
           <w:t>i</w:t>
         </w:r>
@@ -3912,6 +3589,11 @@
         <w:docPartUnique/>
       </w:docPartObj>
     </w:sdtPr>
+    <w:sdtEndPr>
+      <w:rPr>
+        <w:rStyle w:val="Nmerodepgina"/>
+      </w:rPr>
+    </w:sdtEndPr>
     <w:sdtContent>
       <w:p>
         <w:pPr>
@@ -3942,7 +3624,6 @@
         <w:r>
           <w:rPr>
             <w:rStyle w:val="Nmerodepgina"/>
-            <w:noProof/>
           </w:rPr>
           <w:t>1</w:t>
         </w:r>
@@ -4120,9 +3801,6 @@
       <w:jc w:val="left"/>
     </w:pPr>
     <w:r>
-      <w:rPr>
-        <w:noProof/>
-      </w:rPr>
       <w:drawing>
         <wp:inline distT="0" distB="0" distL="0" distR="0" wp14:anchorId="2579054A" wp14:editId="7778E00D">
           <wp:extent cx="2160000" cy="494173"/>

</xml_diff>

<commit_message>
Se subió el avance 1. Atrasado.
</commit_message>
<xml_diff>
--- a/01_Documentos_Memoria/Versiones_consolidadas/Avance_1.docx
+++ b/01_Documentos_Memoria/Versiones_consolidadas/Avance_1.docx
@@ -573,11 +573,12 @@
             </w:rPr>
             <w:fldChar w:fldCharType="separate"/>
           </w:r>
-          <w:hyperlink w:anchor="_Toc239978842" w:history="1">
+          <w:hyperlink w:anchor="_Toc240307649" w:history="1">
             <w:r>
               <w:rPr>
                 <w:rStyle w:val="Hipervnculo"/>
                 <w:noProof/>
+                <w:lang w:val="en-US"/>
               </w:rPr>
               <w:t>Nomenclatura</w:t>
             </w:r>
@@ -600,7 +601,7 @@
                 <w:noProof/>
                 <w:webHidden/>
               </w:rPr>
-              <w:instrText xml:space="preserve"> PAGEREF _Toc239978842 \h </w:instrText>
+              <w:instrText xml:space="preserve"> PAGEREF _Toc240307649 \h </w:instrText>
             </w:r>
             <w:r>
               <w:rPr>
@@ -647,7 +648,7 @@
               <w:lang w:eastAsia="es-CL"/>
             </w:rPr>
           </w:pPr>
-          <w:hyperlink w:anchor="_Toc239978843" w:history="1">
+          <w:hyperlink w:anchor="_Toc240307650" w:history="1">
             <w:r>
               <w:rPr>
                 <w:rStyle w:val="Hipervnculo"/>
@@ -674,7 +675,7 @@
                 <w:noProof/>
                 <w:webHidden/>
               </w:rPr>
-              <w:instrText xml:space="preserve"> PAGEREF _Toc239978843 \h </w:instrText>
+              <w:instrText xml:space="preserve"> PAGEREF _Toc240307650 \h </w:instrText>
             </w:r>
             <w:r>
               <w:rPr>
@@ -722,7 +723,7 @@
               <w:lang w:eastAsia="es-CL"/>
             </w:rPr>
           </w:pPr>
-          <w:hyperlink w:anchor="_Toc239978844" w:history="1">
+          <w:hyperlink w:anchor="_Toc240307651" w:history="1">
             <w:r>
               <w:rPr>
                 <w:rStyle w:val="Hipervnculo"/>
@@ -768,7 +769,7 @@
                 <w:noProof/>
                 <w:webHidden/>
               </w:rPr>
-              <w:instrText xml:space="preserve"> PAGEREF _Toc239978844 \h </w:instrText>
+              <w:instrText xml:space="preserve"> PAGEREF _Toc240307651 \h </w:instrText>
             </w:r>
             <w:r>
               <w:rPr>
@@ -816,7 +817,7 @@
               <w:lang w:eastAsia="es-CL"/>
             </w:rPr>
           </w:pPr>
-          <w:hyperlink w:anchor="_Toc239978845" w:history="1">
+          <w:hyperlink w:anchor="_Toc240307652" w:history="1">
             <w:r>
               <w:rPr>
                 <w:rStyle w:val="Hipervnculo"/>
@@ -862,7 +863,7 @@
                 <w:noProof/>
                 <w:webHidden/>
               </w:rPr>
-              <w:instrText xml:space="preserve"> PAGEREF _Toc239978845 \h </w:instrText>
+              <w:instrText xml:space="preserve"> PAGEREF _Toc240307652 \h </w:instrText>
             </w:r>
             <w:r>
               <w:rPr>
@@ -910,7 +911,7 @@
               <w:lang w:eastAsia="es-CL"/>
             </w:rPr>
           </w:pPr>
-          <w:hyperlink w:anchor="_Toc239978846" w:history="1">
+          <w:hyperlink w:anchor="_Toc240307653" w:history="1">
             <w:r>
               <w:rPr>
                 <w:rStyle w:val="Hipervnculo"/>
@@ -956,7 +957,7 @@
                 <w:noProof/>
                 <w:webHidden/>
               </w:rPr>
-              <w:instrText xml:space="preserve"> PAGEREF _Toc239978846 \h </w:instrText>
+              <w:instrText xml:space="preserve"> PAGEREF _Toc240307653 \h </w:instrText>
             </w:r>
             <w:r>
               <w:rPr>
@@ -1004,7 +1005,7 @@
               <w:lang w:eastAsia="es-CL"/>
             </w:rPr>
           </w:pPr>
-          <w:hyperlink w:anchor="_Toc239978847" w:history="1">
+          <w:hyperlink w:anchor="_Toc240307654" w:history="1">
             <w:r>
               <w:rPr>
                 <w:rStyle w:val="Hipervnculo"/>
@@ -1050,7 +1051,7 @@
                 <w:noProof/>
                 <w:webHidden/>
               </w:rPr>
-              <w:instrText xml:space="preserve"> PAGEREF _Toc239978847 \h </w:instrText>
+              <w:instrText xml:space="preserve"> PAGEREF _Toc240307654 \h </w:instrText>
             </w:r>
             <w:r>
               <w:rPr>
@@ -1096,7 +1097,7 @@
               <w:lang w:eastAsia="es-CL"/>
             </w:rPr>
           </w:pPr>
-          <w:hyperlink w:anchor="_Toc239978848" w:history="1">
+          <w:hyperlink w:anchor="_Toc240307655" w:history="1">
             <w:r>
               <w:rPr>
                 <w:rStyle w:val="Hipervnculo"/>
@@ -1140,7 +1141,7 @@
                 <w:noProof/>
                 <w:webHidden/>
               </w:rPr>
-              <w:instrText xml:space="preserve"> PAGEREF _Toc239978848 \h </w:instrText>
+              <w:instrText xml:space="preserve"> PAGEREF _Toc240307655 \h </w:instrText>
             </w:r>
             <w:r>
               <w:rPr>
@@ -1188,7 +1189,7 @@
               <w:lang w:eastAsia="es-CL"/>
             </w:rPr>
           </w:pPr>
-          <w:hyperlink w:anchor="_Toc239978849" w:history="1">
+          <w:hyperlink w:anchor="_Toc240307656" w:history="1">
             <w:r>
               <w:rPr>
                 <w:rStyle w:val="Hipervnculo"/>
@@ -1234,7 +1235,7 @@
                 <w:noProof/>
                 <w:webHidden/>
               </w:rPr>
-              <w:instrText xml:space="preserve"> PAGEREF _Toc239978849 \h </w:instrText>
+              <w:instrText xml:space="preserve"> PAGEREF _Toc240307656 \h </w:instrText>
             </w:r>
             <w:r>
               <w:rPr>
@@ -1281,11 +1282,12 @@
               <w:lang w:eastAsia="es-CL"/>
             </w:rPr>
           </w:pPr>
-          <w:hyperlink w:anchor="_Toc239978850" w:history="1">
+          <w:hyperlink w:anchor="_Toc240307657" w:history="1">
             <w:r>
               <w:rPr>
                 <w:rStyle w:val="Hipervnculo"/>
                 <w:noProof/>
+                <w:lang w:val="en-US"/>
               </w:rPr>
               <w:t>Referencias</w:t>
             </w:r>
@@ -1308,7 +1310,7 @@
                 <w:noProof/>
                 <w:webHidden/>
               </w:rPr>
-              <w:instrText xml:space="preserve"> PAGEREF _Toc239978850 \h </w:instrText>
+              <w:instrText xml:space="preserve"> PAGEREF _Toc240307657 \h </w:instrText>
             </w:r>
             <w:r>
               <w:rPr>
@@ -1329,6 +1331,80 @@
                 <w:webHidden/>
               </w:rPr>
               <w:t>7</w:t>
+            </w:r>
+            <w:r>
+              <w:rPr>
+                <w:noProof/>
+                <w:webHidden/>
+              </w:rPr>
+              <w:fldChar w:fldCharType="end"/>
+            </w:r>
+          </w:hyperlink>
+        </w:p>
+        <w:p>
+          <w:pPr>
+            <w:pStyle w:val="TDC1"/>
+            <w:tabs>
+              <w:tab w:val="right" w:leader="dot" w:pos="8828"/>
+            </w:tabs>
+            <w:rPr>
+              <w:rFonts w:eastAsiaTheme="minorEastAsia"/>
+              <w:b w:val="0"/>
+              <w:bCs w:val="0"/>
+              <w:i w:val="0"/>
+              <w:iCs w:val="0"/>
+              <w:noProof/>
+              <w:lang w:eastAsia="es-CL"/>
+            </w:rPr>
+          </w:pPr>
+          <w:hyperlink w:anchor="_Toc240307658" w:history="1">
+            <w:r>
+              <w:rPr>
+                <w:rStyle w:val="Hipervnculo"/>
+                <w:noProof/>
+              </w:rPr>
+              <w:t>Anexos</w:t>
+            </w:r>
+            <w:r>
+              <w:rPr>
+                <w:noProof/>
+                <w:webHidden/>
+              </w:rPr>
+              <w:tab/>
+            </w:r>
+            <w:r>
+              <w:rPr>
+                <w:noProof/>
+                <w:webHidden/>
+              </w:rPr>
+              <w:fldChar w:fldCharType="begin"/>
+            </w:r>
+            <w:r>
+              <w:rPr>
+                <w:noProof/>
+                <w:webHidden/>
+              </w:rPr>
+              <w:instrText xml:space="preserve"> PAGEREF _Toc240307658 \h </w:instrText>
+            </w:r>
+            <w:r>
+              <w:rPr>
+                <w:noProof/>
+                <w:webHidden/>
+              </w:rPr>
+            </w:r>
+            <w:r>
+              <w:rPr>
+                <w:noProof/>
+                <w:webHidden/>
+              </w:rPr>
+              <w:fldChar w:fldCharType="separate"/>
+            </w:r>
+            <w:r>
+              <w:rPr>
+                <w:noProof/>
+                <w:webHidden/>
+              </w:rPr>
+              <w:t>9</w:t>
             </w:r>
             <w:r>
               <w:rPr>
@@ -1404,60 +1480,146 @@
           <w:numId w:val="0"/>
         </w:numPr>
         <w:ind w:left="432" w:hanging="432"/>
-      </w:pPr>
-      <w:bookmarkStart w:id="0" w:name="_Toc239978842"/>
-      <w:r>
+        <w:rPr>
+          <w:lang w:val="en-US"/>
+        </w:rPr>
+      </w:pPr>
+      <w:bookmarkStart w:id="0" w:name="_Toc240307649"/>
+      <w:proofErr w:type="spellStart"/>
+      <w:r>
+        <w:rPr>
+          <w:lang w:val="en-US"/>
+        </w:rPr>
         <w:lastRenderedPageBreak/>
         <w:t>Nomenclatura</w:t>
       </w:r>
       <w:bookmarkEnd w:id="0"/>
-    </w:p>
-    <w:p>
-      <w:r>
+      <w:proofErr w:type="spellEnd"/>
+    </w:p>
+    <w:p>
+      <w:pPr>
+        <w:rPr>
+          <w:lang w:val="en-US"/>
+        </w:rPr>
+      </w:pPr>
+      <w:r>
+        <w:rPr>
+          <w:lang w:val="en-US"/>
+        </w:rPr>
         <w:t xml:space="preserve">CFD: Computational Fluid Dynamics </w:t>
       </w:r>
     </w:p>
     <w:p>
-      <w:r>
+      <w:pPr>
+        <w:rPr>
+          <w:lang w:val="en-US"/>
+        </w:rPr>
+      </w:pPr>
+      <w:r>
+        <w:rPr>
+          <w:lang w:val="en-US"/>
+        </w:rPr>
         <w:t>COTS: Commercial Off-The-Shelf</w:t>
       </w:r>
     </w:p>
     <w:p>
-      <w:r>
+      <w:pPr>
+        <w:rPr>
+          <w:lang w:val="en-US"/>
+        </w:rPr>
+      </w:pPr>
+      <w:r>
+        <w:rPr>
+          <w:lang w:val="en-US"/>
+        </w:rPr>
         <w:t>Datcom: Data Compendium</w:t>
       </w:r>
     </w:p>
     <w:p>
-      <w:r>
+      <w:pPr>
+        <w:rPr>
+          <w:lang w:val="en-US"/>
+        </w:rPr>
+      </w:pPr>
+      <w:r>
+        <w:rPr>
+          <w:lang w:val="en-US"/>
+        </w:rPr>
         <w:t xml:space="preserve">LOC: Loss of Control </w:t>
       </w:r>
     </w:p>
     <w:p>
-      <w:r>
+      <w:pPr>
+        <w:rPr>
+          <w:lang w:val="en-US"/>
+        </w:rPr>
+      </w:pPr>
+      <w:r>
+        <w:rPr>
+          <w:lang w:val="en-US"/>
+        </w:rPr>
         <w:t xml:space="preserve">NACA: National Advisory Committee for Aeronautics </w:t>
       </w:r>
     </w:p>
     <w:p>
-      <w:r>
+      <w:pPr>
+        <w:rPr>
+          <w:lang w:val="en-US"/>
+        </w:rPr>
+      </w:pPr>
+      <w:r>
+        <w:rPr>
+          <w:lang w:val="en-US"/>
+        </w:rPr>
         <w:t xml:space="preserve">RMS: Root Mean Square </w:t>
       </w:r>
     </w:p>
     <w:p>
-      <w:r>
+      <w:pPr>
+        <w:rPr>
+          <w:lang w:val="en-US"/>
+        </w:rPr>
+      </w:pPr>
+      <w:r>
+        <w:rPr>
+          <w:lang w:val="en-US"/>
+        </w:rPr>
         <w:t>SIPRI: Stockholm International Peace Research Institute</w:t>
       </w:r>
     </w:p>
     <w:p>
-      <w:r>
+      <w:pPr>
+        <w:rPr>
+          <w:lang w:val="en-US"/>
+        </w:rPr>
+      </w:pPr>
+      <w:r>
+        <w:rPr>
+          <w:lang w:val="en-US"/>
+        </w:rPr>
         <w:t xml:space="preserve">UAV: Unmanned Aerial Vehicle </w:t>
       </w:r>
     </w:p>
     <w:p>
-      <w:r>
+      <w:pPr>
+        <w:rPr>
+          <w:lang w:val="en-US"/>
+        </w:rPr>
+      </w:pPr>
+      <w:r>
+        <w:rPr>
+          <w:lang w:val="en-US"/>
+        </w:rPr>
         <w:t xml:space="preserve">USD: United States Dollar </w:t>
       </w:r>
     </w:p>
-    <w:p/>
+    <w:p>
+      <w:pPr>
+        <w:rPr>
+          <w:lang w:val="en-US"/>
+        </w:rPr>
+      </w:pPr>
+    </w:p>
     <w:p>
       <w:pPr>
         <w:pStyle w:val="Ttulo2"/>
@@ -1467,7 +1629,7 @@
         </w:numPr>
         <w:ind w:left="576" w:hanging="576"/>
       </w:pPr>
-      <w:bookmarkStart w:id="1" w:name="_Toc239978843"/>
+      <w:bookmarkStart w:id="1" w:name="_Toc240307650"/>
       <w:r>
         <w:t>Símbolos griegos</w:t>
       </w:r>
@@ -1590,7 +1752,7 @@
       <w:pPr>
         <w:pStyle w:val="Ttulo1"/>
       </w:pPr>
-      <w:bookmarkStart w:id="2" w:name="_Toc239978844"/>
+      <w:bookmarkStart w:id="2" w:name="_Toc240307651"/>
       <w:r>
         <w:lastRenderedPageBreak/>
         <w:t>Introducción</w:t>
@@ -1601,7 +1763,7 @@
       <w:pPr>
         <w:pStyle w:val="Ttulo2"/>
       </w:pPr>
-      <w:bookmarkStart w:id="3" w:name="_Toc239978845"/>
+      <w:bookmarkStart w:id="3" w:name="_Toc240307652"/>
       <w:r>
         <w:t>Contexto</w:t>
       </w:r>
@@ -2132,7 +2294,7 @@
       <w:pPr>
         <w:pStyle w:val="Ttulo2"/>
       </w:pPr>
-      <w:bookmarkStart w:id="28" w:name="_Toc239978846"/>
+      <w:bookmarkStart w:id="28" w:name="_Toc240307653"/>
       <w:r>
         <w:t>Hipótesis</w:t>
       </w:r>
@@ -2147,7 +2309,7 @@
       <w:pPr>
         <w:pStyle w:val="Ttulo2"/>
       </w:pPr>
-      <w:bookmarkStart w:id="29" w:name="_Toc239978847"/>
+      <w:bookmarkStart w:id="29" w:name="_Toc240307654"/>
       <w:r>
         <w:t>Objetivos</w:t>
       </w:r>
@@ -2170,7 +2332,7 @@
       <w:pPr>
         <w:pStyle w:val="Ttulo3"/>
       </w:pPr>
-      <w:bookmarkStart w:id="30" w:name="_Toc239978848"/>
+      <w:bookmarkStart w:id="30" w:name="_Toc240307655"/>
       <w:r>
         <w:t>Objetivos específicos</w:t>
       </w:r>
@@ -2257,7 +2419,7 @@
       <w:pPr>
         <w:pStyle w:val="Ttulo1"/>
       </w:pPr>
-      <w:bookmarkStart w:id="31" w:name="_Toc239978849"/>
+      <w:bookmarkStart w:id="31" w:name="_Toc240307656"/>
       <w:r>
         <w:t>Metodología</w:t>
       </w:r>
@@ -2342,7 +2504,7 @@
         <w:br w:type="page"/>
       </w:r>
     </w:p>
-    <w:bookmarkStart w:id="32" w:name="_Toc239978850" w:displacedByCustomXml="next"/>
+    <w:bookmarkStart w:id="32" w:name="_Toc240307657" w:displacedByCustomXml="next"/>
     <w:sdt>
       <w:sdtPr>
         <w:rPr>
@@ -2371,8 +2533,14 @@
         <w:p>
           <w:pPr>
             <w:pStyle w:val="Anexo"/>
+            <w:rPr>
+              <w:lang w:val="en-US"/>
+            </w:rPr>
           </w:pPr>
           <w:r>
+            <w:rPr>
+              <w:lang w:val="en-US"/>
+            </w:rPr>
             <w:t>Referencias</w:t>
           </w:r>
         </w:p>
@@ -2382,14 +2550,14 @@
     <w:p>
       <w:pPr>
         <w:pStyle w:val="Bibliografa"/>
+        <w:rPr>
+          <w:lang w:val="en-US"/>
+        </w:rPr>
       </w:pPr>
     </w:p>
     <w:p>
       <w:pPr>
         <w:pStyle w:val="Bibliografa"/>
-        <w:rPr>
-          <w:lang w:val="en-US"/>
-        </w:rPr>
       </w:pPr>
       <w:bookmarkStart w:id="33" w:name="ZOTERO_BREF_eIRCVLm5ypBy"/>
       <w:r>
@@ -2415,21 +2583,20 @@
         <w:rPr>
           <w:lang w:val="en-US"/>
         </w:rPr>
-        <w:t xml:space="preserve"> Thesis, Utah State University, 2016. [En línea]. Disponible en: </w:t>
+        <w:t xml:space="preserve"> Thesis, Utah State University, 2016. </w:t>
+      </w:r>
+      <w:r>
+        <w:t xml:space="preserve">[En línea]. Disponible en: </w:t>
       </w:r>
       <w:hyperlink r:id="rId13" w:history="1">
         <w:r>
           <w:rPr>
             <w:rStyle w:val="Hipervnculo"/>
-            <w:lang w:val="en-US"/>
           </w:rPr>
           <w:t>https://ui.adsabs.harvard.edu/abs/2016MsT.........46S/abstract</w:t>
         </w:r>
       </w:hyperlink>
       <w:r>
-        <w:rPr>
-          <w:lang w:val="en-US"/>
-        </w:rPr>
         <w:t xml:space="preserve"> </w:t>
       </w:r>
     </w:p>
@@ -2667,9 +2834,6 @@
     <w:p>
       <w:pPr>
         <w:pStyle w:val="Bibliografa"/>
-        <w:rPr>
-          <w:lang w:val="en-US"/>
-        </w:rPr>
       </w:pPr>
       <w:r>
         <w:rPr>
@@ -2682,30 +2846,26 @@
           <w:lang w:val="en-US"/>
         </w:rPr>
         <w:tab/>
-        <w:t xml:space="preserve">Global Market Insights, “Precision Guided Munition Market Size &amp; Share Report, 2034”. 2025. [En línea]. Disponible en: </w:t>
+        <w:t xml:space="preserve">Global Market Insights, “Precision Guided Munition Market Size &amp; Share Report, 2034”. </w:t>
+      </w:r>
+      <w:r>
+        <w:t xml:space="preserve">2025. [En línea]. Disponible en: </w:t>
       </w:r>
       <w:hyperlink r:id="rId16" w:history="1">
         <w:r>
           <w:rPr>
             <w:rStyle w:val="Hipervnculo"/>
-            <w:lang w:val="en-US"/>
           </w:rPr>
           <w:t>https://www.gminsights.com/industry-analysis/precision-guided-munition-market</w:t>
         </w:r>
       </w:hyperlink>
       <w:r>
-        <w:rPr>
-          <w:lang w:val="en-US"/>
-        </w:rPr>
         <w:t xml:space="preserve"> </w:t>
       </w:r>
     </w:p>
     <w:p>
       <w:pPr>
         <w:pStyle w:val="Bibliografa"/>
-        <w:rPr>
-          <w:lang w:val="en-US"/>
-        </w:rPr>
       </w:pPr>
       <w:r>
         <w:rPr>
@@ -2718,30 +2878,26 @@
           <w:lang w:val="en-US"/>
         </w:rPr>
         <w:tab/>
-        <w:t xml:space="preserve">Research and Markets, “Civilian Drones Market — Global Forecast 2026–2032”. 2026. [En línea]. Disponible en: </w:t>
+        <w:t xml:space="preserve">Research and Markets, “Civilian Drones Market — Global Forecast 2026–2032”. </w:t>
+      </w:r>
+      <w:r>
+        <w:t xml:space="preserve">2026. [En línea]. Disponible en: </w:t>
       </w:r>
       <w:hyperlink r:id="rId17" w:history="1">
         <w:r>
           <w:rPr>
             <w:rStyle w:val="Hipervnculo"/>
-            <w:lang w:val="en-US"/>
           </w:rPr>
           <w:t>https://www.researchandmarkets.com/report/civilian-drone</w:t>
         </w:r>
       </w:hyperlink>
       <w:r>
-        <w:rPr>
-          <w:lang w:val="en-US"/>
-        </w:rPr>
         <w:t xml:space="preserve"> </w:t>
       </w:r>
     </w:p>
     <w:p>
       <w:pPr>
         <w:pStyle w:val="Bibliografa"/>
-        <w:rPr>
-          <w:lang w:val="en-US"/>
-        </w:rPr>
       </w:pPr>
       <w:r>
         <w:rPr>
@@ -2754,30 +2910,26 @@
           <w:lang w:val="en-US"/>
         </w:rPr>
         <w:tab/>
-        <w:t xml:space="preserve">MarketsandMarkets, “Unmanned Aerial Vehicle (UAV) Market Report 2025–2030”. 2025. [En línea]. Disponible en: </w:t>
+        <w:t xml:space="preserve">MarketsandMarkets, “Unmanned Aerial Vehicle (UAV) Market Report 2025–2030”. </w:t>
+      </w:r>
+      <w:r>
+        <w:t xml:space="preserve">2025. [En línea]. Disponible en: </w:t>
       </w:r>
       <w:hyperlink r:id="rId18" w:history="1">
         <w:r>
           <w:rPr>
             <w:rStyle w:val="Hipervnculo"/>
-            <w:lang w:val="en-US"/>
           </w:rPr>
           <w:t>https://www.marketsandmarkets.com/Market-Reports/unmanned-aerial-vehicles-uav-market-662.html</w:t>
         </w:r>
       </w:hyperlink>
       <w:r>
-        <w:rPr>
-          <w:lang w:val="en-US"/>
-        </w:rPr>
         <w:t xml:space="preserve"> </w:t>
       </w:r>
     </w:p>
     <w:p>
       <w:pPr>
         <w:pStyle w:val="Bibliografa"/>
-        <w:rPr>
-          <w:lang w:val="en-US"/>
-        </w:rPr>
       </w:pPr>
       <w:r>
         <w:rPr>
@@ -2790,30 +2942,26 @@
           <w:lang w:val="en-US"/>
         </w:rPr>
         <w:tab/>
-        <w:t xml:space="preserve">Aerospace America / AIAA, “Symbiosis: Why CFD and Wind Tunnels Need Each Other”. 2021. [En línea]. Disponible en: </w:t>
+        <w:t xml:space="preserve">Aerospace America / AIAA, “Symbiosis: Why CFD and Wind Tunnels Need Each Other”. </w:t>
+      </w:r>
+      <w:r>
+        <w:t xml:space="preserve">2021. [En línea]. Disponible en: </w:t>
       </w:r>
       <w:hyperlink r:id="rId19" w:history="1">
         <w:r>
           <w:rPr>
             <w:rStyle w:val="Hipervnculo"/>
-            <w:lang w:val="en-US"/>
           </w:rPr>
           <w:t>https://aerospaceamerica.aiaa.org/features/symbiosis-why-cfd-and-wind-tunnels-need-each-other/</w:t>
         </w:r>
       </w:hyperlink>
       <w:r>
-        <w:rPr>
-          <w:lang w:val="en-US"/>
-        </w:rPr>
         <w:t xml:space="preserve"> </w:t>
       </w:r>
     </w:p>
     <w:p>
       <w:pPr>
         <w:pStyle w:val="Bibliografa"/>
-        <w:rPr>
-          <w:lang w:val="en-US"/>
-        </w:rPr>
       </w:pPr>
       <w:r>
         <w:rPr>
@@ -2834,52 +2982,40 @@
           <w:iCs/>
           <w:lang w:val="en-US"/>
         </w:rPr>
-        <w:t>ArXiv Prepr. ArXiv240205985</w:t>
-      </w:r>
-      <w:r>
-        <w:rPr>
-          <w:lang w:val="en-US"/>
-        </w:rPr>
+        <w:t xml:space="preserve">ArXiv Prepr. </w:t>
+      </w:r>
+      <w:r>
+        <w:rPr>
+          <w:i/>
+          <w:iCs/>
+        </w:rPr>
+        <w:t>ArXiv240205985</w:t>
+      </w:r>
+      <w:r>
         <w:t xml:space="preserve">, 2024, [En línea]. Disponible en: </w:t>
       </w:r>
       <w:hyperlink r:id="rId20" w:history="1">
         <w:r>
           <w:rPr>
             <w:rStyle w:val="Hipervnculo"/>
-            <w:lang w:val="en-US"/>
           </w:rPr>
           <w:t>https://arxiv.org/pdf/2402.05985</w:t>
         </w:r>
       </w:hyperlink>
       <w:r>
-        <w:rPr>
-          <w:lang w:val="en-US"/>
-        </w:rPr>
         <w:t xml:space="preserve"> </w:t>
       </w:r>
     </w:p>
     <w:p>
       <w:pPr>
         <w:pStyle w:val="Bibliografa"/>
-        <w:rPr>
-          <w:lang w:val="en-US"/>
-        </w:rPr>
-      </w:pPr>
-      <w:r>
-        <w:rPr>
-          <w:lang w:val="en-US"/>
-        </w:rPr>
+      </w:pPr>
+      <w:r>
         <w:t>[12]</w:t>
       </w:r>
       <w:r>
-        <w:rPr>
-          <w:lang w:val="en-US"/>
-        </w:rPr>
         <w:tab/>
-        <w:t xml:space="preserve">Stockholm International Peace Research Institute (SIPRI), “Informe SIPRI 2025: Chile </w:t>
-      </w:r>
-      <w:r>
-        <w:t xml:space="preserve">sigue entre los países con más gasto militar en América Latina”. 2025. [En línea]. Disponible en: </w:t>
+        <w:t xml:space="preserve">Stockholm International Peace Research Institute (SIPRI), “Informe SIPRI 2025: Chile sigue entre los países con más gasto militar en América Latina”. 2025. [En línea]. Disponible en: </w:t>
       </w:r>
       <w:hyperlink r:id="rId21" w:history="1">
         <w:r>
@@ -2890,9 +3026,6 @@
         </w:r>
       </w:hyperlink>
       <w:r>
-        <w:rPr>
-          <w:lang w:val="en-US"/>
-        </w:rPr>
         <w:t xml:space="preserve"> </w:t>
       </w:r>
     </w:p>
@@ -2989,16 +3122,7 @@
         <w:rPr>
           <w:lang w:val="en-US"/>
         </w:rPr>
-        <w:t xml:space="preserve"> 2, pp. 498–507, 2008, doi:</w:t>
-      </w:r>
-      <w:r>
-        <w:t xml:space="preserve"> </w:t>
-      </w:r>
-      <w:r>
-        <w:rPr>
-          <w:lang w:val="en-US"/>
-        </w:rPr>
-        <w:t>10.2514/1.32308.</w:t>
+        <w:t xml:space="preserve"> 2, pp. 498–507, 2008, doi: 10.2514/1.32308.</w:t>
       </w:r>
     </w:p>
     <w:p>
@@ -3149,9 +3273,6 @@
     <w:p>
       <w:pPr>
         <w:pStyle w:val="Bibliografa"/>
-        <w:rPr>
-          <w:lang w:val="en-US"/>
-        </w:rPr>
       </w:pPr>
       <w:r>
         <w:rPr>
@@ -3172,25 +3293,25 @@
           <w:iCs/>
           <w:lang w:val="en-US"/>
         </w:rPr>
-        <w:t>IEEE Trans. Aerosp. Electron. Syst.</w:t>
-      </w:r>
-      <w:r>
-        <w:rPr>
-          <w:lang w:val="en-US"/>
-        </w:rPr>
+        <w:t xml:space="preserve">IEEE Trans. </w:t>
+      </w:r>
+      <w:r>
+        <w:rPr>
+          <w:i/>
+          <w:iCs/>
+        </w:rPr>
+        <w:t>Aerosp. Electron. Syst.</w:t>
+      </w:r>
+      <w:r>
         <w:t>, vol. 37, n</w:t>
       </w:r>
       <w:r>
         <w:rPr>
           <w:vertAlign w:val="superscript"/>
-          <w:lang w:val="en-US"/>
         </w:rPr>
         <w:t>o</w:t>
       </w:r>
       <w:r>
-        <w:rPr>
-          <w:lang w:val="en-US"/>
-        </w:rPr>
         <w:t xml:space="preserve"> 4, pp. 1384–1392, 2001, doi: 10.1109/7.976972.</w:t>
       </w:r>
     </w:p>
@@ -3212,11 +3333,116 @@
           <w:color w:val="000000" w:themeColor="text1"/>
         </w:rPr>
       </w:pPr>
+      <w:r>
+        <w:rPr>
+          <w:color w:val="000000" w:themeColor="text1"/>
+        </w:rPr>
+        <w:br w:type="page"/>
+      </w:r>
+    </w:p>
+    <w:p>
+      <w:pPr>
+        <w:pStyle w:val="Ttulo1"/>
+        <w:numPr>
+          <w:ilvl w:val="0"/>
+          <w:numId w:val="0"/>
+        </w:numPr>
+        <w:ind w:left="432"/>
+      </w:pPr>
+      <w:bookmarkStart w:id="34" w:name="_Toc240307658"/>
+      <w:r>
+        <w:lastRenderedPageBreak/>
+        <w:t>Anexos</w:t>
+      </w:r>
+      <w:bookmarkEnd w:id="34"/>
+    </w:p>
+    <w:p>
+      <w:pPr>
+        <w:spacing w:after="160" w:line="259" w:lineRule="auto"/>
+        <w:jc w:val="left"/>
+        <w:rPr>
+          <w:color w:val="000000" w:themeColor="text1"/>
+        </w:rPr>
+      </w:pPr>
+      <w:r>
+        <w:rPr>
+          <w:color w:val="000000" w:themeColor="text1"/>
+        </w:rPr>
+        <w:t>Carta Gant</w:t>
+      </w:r>
+      <w:r>
+        <w:rPr>
+          <w:color w:val="000000" w:themeColor="text1"/>
+        </w:rPr>
+        <w:t>t</w:t>
+      </w:r>
+    </w:p>
+    <w:p>
+      <w:pPr>
+        <w:spacing w:after="160" w:line="259" w:lineRule="auto"/>
+        <w:jc w:val="left"/>
+        <w:rPr>
+          <w:color w:val="000000" w:themeColor="text1"/>
+        </w:rPr>
+      </w:pPr>
+      <w:r>
+        <w:rPr>
+          <w:noProof/>
+        </w:rPr>
+        <w:drawing>
+          <wp:inline distT="0" distB="0" distL="0" distR="0" wp14:anchorId="6BD10126" wp14:editId="6806BD2A">
+            <wp:extent cx="5612130" cy="3606800"/>
+            <wp:effectExtent l="0" t="0" r="7620" b="0"/>
+            <wp:docPr id="797322921" name="Imagen 5"/>
+            <wp:cNvGraphicFramePr>
+              <a:graphicFrameLocks xmlns:a="http://schemas.openxmlformats.org/drawingml/2006/main" noChangeAspect="1"/>
+            </wp:cNvGraphicFramePr>
+            <a:graphic xmlns:a="http://schemas.openxmlformats.org/drawingml/2006/main">
+              <a:graphicData uri="http://schemas.openxmlformats.org/drawingml/2006/picture">
+                <pic:pic xmlns:pic="http://schemas.openxmlformats.org/drawingml/2006/picture">
+                  <pic:nvPicPr>
+                    <pic:cNvPr id="0" name="Picture 4"/>
+                    <pic:cNvPicPr>
+                      <a:picLocks noChangeAspect="1" noChangeArrowheads="1"/>
+                    </pic:cNvPicPr>
+                  </pic:nvPicPr>
+                  <pic:blipFill>
+                    <a:blip r:embed="rId22">
+                      <a:extLst>
+                        <a:ext uri="{28A0092B-C50C-407E-A947-70E740481C1C}">
+                          <a14:useLocalDpi xmlns:a14="http://schemas.microsoft.com/office/drawing/2010/main" val="0"/>
+                        </a:ext>
+                      </a:extLst>
+                    </a:blip>
+                    <a:srcRect/>
+                    <a:stretch>
+                      <a:fillRect/>
+                    </a:stretch>
+                  </pic:blipFill>
+                  <pic:spPr bwMode="auto">
+                    <a:xfrm>
+                      <a:off x="0" y="0"/>
+                      <a:ext cx="5612130" cy="3606800"/>
+                    </a:xfrm>
+                    <a:prstGeom prst="rect">
+                      <a:avLst/>
+                    </a:prstGeom>
+                    <a:noFill/>
+                    <a:ln>
+                      <a:noFill/>
+                    </a:ln>
+                  </pic:spPr>
+                </pic:pic>
+              </a:graphicData>
+            </a:graphic>
+          </wp:inline>
+        </w:drawing>
+      </w:r>
     </w:p>
     <w:sectPr>
-      <w:headerReference w:type="default" r:id="rId22"/>
-      <w:footerReference w:type="default" r:id="rId23"/>
-      <w:footerReference w:type="first" r:id="rId24"/>
+      <w:headerReference w:type="default" r:id="rId23"/>
+      <w:footerReference w:type="default" r:id="rId24"/>
+      <w:footerReference w:type="first" r:id="rId25"/>
       <w:pgSz w:w="12240" w:h="15840"/>
       <w:pgMar w:top="1417" w:right="1701" w:bottom="1417" w:left="1701" w:header="708" w:footer="708" w:gutter="0"/>
       <w:pgNumType w:start="1"/>
@@ -3801,11 +4027,14 @@
       <w:jc w:val="left"/>
     </w:pPr>
     <w:r>
+      <w:rPr>
+        <w:noProof/>
+      </w:rPr>
       <w:drawing>
         <wp:inline distT="0" distB="0" distL="0" distR="0" wp14:anchorId="2579054A" wp14:editId="7778E00D">
           <wp:extent cx="2160000" cy="494173"/>
           <wp:effectExtent l="0" t="0" r="0" b="1270"/>
-          <wp:docPr id="619545722" name="Imagen 1" descr="Imagen que contiene botella, exterior, firmar, gente&#10;&#10;El contenido generado por IA puede ser incorrecto."/>
+          <wp:docPr id="1977306643" name="Imagen 1" descr="Imagen que contiene botella, exterior, firmar, gente&#10;&#10;El contenido generado por IA puede ser incorrecto."/>
           <wp:cNvGraphicFramePr>
             <a:graphicFrameLocks xmlns:a="http://schemas.openxmlformats.org/drawingml/2006/main" noChangeAspect="1"/>
           </wp:cNvGraphicFramePr>
@@ -4880,6 +5109,7 @@
   <w:style w:type="character" w:default="1" w:styleId="Fuentedeprrafopredeter">
     <w:name w:val="Default Paragraph Font"/>
     <w:uiPriority w:val="1"/>
+    <w:semiHidden/>
     <w:unhideWhenUsed/>
   </w:style>
   <w:style w:type="table" w:default="1" w:styleId="Tablanormal">

</xml_diff>